<commit_message>
Rewrite strategy doc in first person, remove meta/technical references
Co-authored-by: arena-agent <297053741+arena-agent@users.noreply.github.com>
</commit_message>
<xml_diff>
--- a/brand/Yurich-CityCode-RWA-LinkedIn-Strategy.docx
+++ b/brand/Yurich-CityCode-RWA-LinkedIn-Strategy.docx
@@ -66,11 +66,6 @@
       </w:r>
     </w:p>
     <w:p>
-      <w:r>
-        <w:br w:type="page"/>
-      </w:r>
-    </w:p>
-    <w:p>
       <w:pPr>
         <w:pStyle w:val="Heading1"/>
       </w:pPr>
@@ -91,81 +86,26 @@
       </w:r>
     </w:p>
     <w:p>
-      <w:r>
-        <w:br w:type="page"/>
-      </w:r>
-    </w:p>
-    <w:p>
       <w:pPr>
         <w:pStyle w:val="Heading1"/>
       </w:pPr>
       <w:r>
-        <w:t>00. О документе</w:t>
-      </w:r>
-    </w:p>
-    <w:p>
-      <w:r>
-        <w:t>Это рабочая аналитика, а не брендбук и не рекламный буклет. Задача: собрать то, что уже есть у Юрича (сайт YurichHub, модули Sevastopol AI, City Code, Crimea RWA, курс, глоссарий, офер ЦФА), наложить это на то, как устроена ниша RWA в мире, и на то, как устроен LinkedIn как платформа, и выдать на выходе: а) формулировку позиции, б) карту аудиторий, в) календарь, г) 16 готовых текстов постов на русском и 16 на английском.</w:t>
-      </w:r>
-    </w:p>
-    <w:p>
-      <w:r>
-        <w:t xml:space="preserve">Источники: </w:t>
-      </w:r>
-      <w:r>
-        <w:rPr>
-          <w:rFonts w:ascii="Consolas" w:hAnsi="Consolas"/>
-          <w:color w:val="5B7A00"/>
-        </w:rPr>
-        <w:t>index.html</w:t>
-      </w:r>
-      <w:r>
-        <w:t xml:space="preserve">, </w:t>
-      </w:r>
-      <w:r>
-        <w:rPr>
-          <w:rFonts w:ascii="Consolas" w:hAnsi="Consolas"/>
-          <w:color w:val="5B7A00"/>
-        </w:rPr>
-        <w:t>course.html</w:t>
-      </w:r>
-      <w:r>
-        <w:t xml:space="preserve">, </w:t>
-      </w:r>
-      <w:r>
-        <w:rPr>
-          <w:rFonts w:ascii="Consolas" w:hAnsi="Consolas"/>
-          <w:color w:val="5B7A00"/>
-        </w:rPr>
-        <w:t>cfa.html</w:t>
-      </w:r>
-      <w:r>
-        <w:t xml:space="preserve">, </w:t>
-      </w:r>
-      <w:r>
-        <w:rPr>
-          <w:rFonts w:ascii="Consolas" w:hAnsi="Consolas"/>
-          <w:color w:val="5B7A00"/>
-        </w:rPr>
-        <w:t>glossary.html</w:t>
-      </w:r>
-      <w:r>
-        <w:t xml:space="preserve">, канон стиля </w:t>
-      </w:r>
-      <w:r>
-        <w:rPr>
-          <w:rFonts w:ascii="Consolas" w:hAnsi="Consolas"/>
-          <w:color w:val="5B7A00"/>
-        </w:rPr>
-        <w:t>YURICHHUB-STYLE.md</w:t>
-      </w:r>
-      <w:r>
-        <w:t>, открытые данные о состоянии рынка токенизации реальных активов (RWA) на 2025 - 2026 год, открытые практики построения виральных постов на LinkedIn (данные LinkedIn creator экономики, разборы форматов 2025 - 2026).</w:t>
-      </w:r>
-    </w:p>
-    <w:p>
-      <w:r>
-        <w:t xml:space="preserve">Все цифры про сам проект (посетители бота, число заявок в City Code, объём первого реального выпуска ЦФА) в этом документе размечены как </w:t>
+        <w:t>00. Зачем я это написал</w:t>
+      </w:r>
+    </w:p>
+    <w:p>
+      <w:r>
+        <w:t>Это не брендбук и не рекламный буклет. Это моя рабочая аналитика перед выходом на LinkedIn.</w:t>
+      </w:r>
+    </w:p>
+    <w:p>
+      <w:r>
+        <w:t>Я свёл в одном месте то, что уже построил: бота по городу, закрытый круг, тестовый выпуск ЦФА, курс, глоссарий, услугу сборки выпуска для бизнеса. Наложил это на то, как устроена ниша RWA в мире, и на то, как устроен LinkedIn как платформа. На выходе: формулировка моей позиции, карта моей аудитории, календарь публикаций и 16 готовых текстов постов на русском и 16 на английском.</w:t>
+      </w:r>
+    </w:p>
+    <w:p>
+      <w:r>
+        <w:t xml:space="preserve">Все цифры про мой проект (посетители бота, число заявок в City Code, объём первого реального выпуска ЦФА), которые я не могу подтвердить на сегодняшний день, я размечаю как </w:t>
       </w:r>
       <w:r>
         <w:rPr>
@@ -175,7 +115,7 @@
         <w:t>[ПОДСТАВИТЬ ЖИВУЮ ЦИФРУ]</w:t>
       </w:r>
       <w:r>
-        <w:t>. Это сделано намеренно: брендбук Юрича прямо запрещает выдумывать цифры ради ритма. Автор поста обязан подставить реальное число перед публикацией или убрать карточку.</w:t>
+        <w:t>. Это не формальность: я сам себе запрещаю выдумывать цифры ради ритма поста. Перед публикацией я обязан подставить реальное число или убрать карточку целиком.</w:t>
       </w:r>
     </w:p>
     <w:p>
@@ -187,12 +127,7 @@
           <w:color w:val="6E6E6E"/>
           <w:sz w:val="16"/>
         </w:rPr>
-        <w:t>————————————————————</w:t>
-      </w:r>
-    </w:p>
-    <w:p>
-      <w:r>
-        <w:br w:type="page"/>
+        <w:t>..............................</w:t>
       </w:r>
     </w:p>
     <w:p>
@@ -200,77 +135,27 @@
         <w:pStyle w:val="Heading1"/>
       </w:pPr>
       <w:r>
-        <w:t>01. Кто такой Юрич</w:t>
-      </w:r>
-    </w:p>
-    <w:p>
-      <w:r>
-        <w:t xml:space="preserve">Юрич, он же Павел Васильковский, Севастополь. Публичные контуры: канал </w:t>
-      </w:r>
-      <w:r>
-        <w:rPr>
-          <w:rFonts w:ascii="Consolas" w:hAnsi="Consolas"/>
-          <w:color w:val="5B7A00"/>
-        </w:rPr>
-        <w:t>t.me/YuRichRWA</w:t>
-      </w:r>
-      <w:r>
-        <w:t xml:space="preserve">, личка </w:t>
-      </w:r>
-      <w:r>
-        <w:rPr>
-          <w:rFonts w:ascii="Consolas" w:hAnsi="Consolas"/>
-          <w:color w:val="5B7A00"/>
-        </w:rPr>
-        <w:t>t.me/PavelYuRichRWA</w:t>
-      </w:r>
-      <w:r>
-        <w:t xml:space="preserve">, X </w:t>
-      </w:r>
-      <w:r>
-        <w:rPr>
-          <w:rFonts w:ascii="Consolas" w:hAnsi="Consolas"/>
-          <w:color w:val="5B7A00"/>
-        </w:rPr>
-        <w:t>x.com/PavelYuRichRWA</w:t>
-      </w:r>
-      <w:r>
-        <w:t xml:space="preserve">. Координаты точки сборки: </w:t>
-      </w:r>
-      <w:r>
-        <w:rPr>
-          <w:rFonts w:ascii="Consolas" w:hAnsi="Consolas"/>
-          <w:color w:val="5B7A00"/>
-        </w:rPr>
-        <w:t>44.6167° N · 33.5258° E</w:t>
-      </w:r>
-      <w:r>
-        <w:t xml:space="preserve">, Чёрное море, старт проекта размечен как </w:t>
-      </w:r>
-      <w:r>
-        <w:rPr>
-          <w:rFonts w:ascii="Consolas" w:hAnsi="Consolas"/>
-          <w:color w:val="5B7A00"/>
-        </w:rPr>
-        <w:t>EST. 2026</w:t>
-      </w:r>
-      <w:r>
-        <w:t>.</w:t>
-      </w:r>
-    </w:p>
-    <w:p>
-      <w:r>
-        <w:t>Это не крипто-блогер, который комментирует чужие графики, и не классический Web3-фаундер с питч-дэком про "следующий Ethereum". Юрич строит то, что сам называет операционной системой города: слой за слоем, от бесплатного бота до регулируемого финансового инструмента. Это важно для позиционирования: большинство людей, которые сегодня громко говорят про RWA в LinkedIn, либо управляют институциональным капиталом (BlackRock, Franklin Templeton, Fidelity), либо строят инфраструктурные протоколы (Securitize, Ondo, Centrifuge, Superstate). Почти никто не говорит про RWA на уровне одного конкретного города и его живой выручки. Это и есть белое пятно, в которое целится Юрич.</w:t>
-      </w:r>
-    </w:p>
-    <w:p>
-      <w:r>
-        <w:t>Голос Юрича, по его же канону: сухо, на "ты", без слов "уникальный", "погрузись", "успей", "революция", "альфа". Цифра важнее прилагательного. Ноль имеет смысл только как отказ: "0 сигналов", "0 денег на мой счёт". Можно сомневаться вслух в разборе, нельзя сомневаться в роли "я не оператор и не биржа" и в чужих деньгах. Это редкий для крипто-ниши регистр: большинство фаундеров в RWA продают уверенность, Юрич демонстративно продаёт трезвость. На LinkedIn, где аудитория за 2025 - 2026 год заметно устала от "мы разблокируем триллионы" риторики, трезвость читается как контрарианская позиция и именно поэтому имеет вирусный потенциал.</w:t>
-      </w:r>
-    </w:p>
-    <w:p>
-      <w:r>
-        <w:t>Что уже построено, по порядку:</w:t>
+        <w:t>01. Кто я</w:t>
+      </w:r>
+    </w:p>
+    <w:p>
+      <w:r>
+        <w:t>Меня зовут Юрич, я же Павел Васильковский, живу в Севастополе.</w:t>
+      </w:r>
+    </w:p>
+    <w:p>
+      <w:r>
+        <w:t>Я не крипто-блогер, который комментирует чужие графики, и не классический Web3-фаундер с питч-дэком про "следующий Ethereum". Я строю то, что сам называю операционной системой города: слой за слоем, от бесплатного бота до регулируемого финансового инструмента. Это важно для моего позиционирования: большинство людей, которые сегодня громко говорят про RWA в LinkedIn, либо управляют институциональным капиталом (BlackRock, Franklin Templeton, Fidelity), либо строят инфраструктурные протоколы (Securitize, Ondo, Centrifuge, Superstate). Почти никто не говорит про RWA на уровне одного конкретного города и его живой выручки. Это и есть то белое пятно, в которое я целюсь.</w:t>
+      </w:r>
+    </w:p>
+    <w:p>
+      <w:r>
+        <w:t>Мой голос: сухо, на "ты", без слов "уникальный", "погрузись", "успей", "революция", "альфа". Цифра важнее прилагательного. Ноль имеет смысл у меня только как отказ: "0 сигналов", "0 денег на мой счёт". Я могу сомневаться вслух в разборе, но не сомневаюсь в своей роли "я не оператор и не биржа" и не играю с чужими деньгами. Это редкий для крипто-ниши регистр: большинство фаундеров в RWA продают уверенность, я демонстративно продаю трезвость. На LinkedIn, где аудитория за 2025 - 2026 год заметно устала от "мы разблокируем триллионы" риторики, трезвость читается как контрарианская позиция, и именно поэтому у неё есть вирусный потенциал.</w:t>
+      </w:r>
+    </w:p>
+    <w:p>
+      <w:r>
+        <w:t>Что я уже построил, по порядку:</w:t>
       </w:r>
     </w:p>
     <w:p>
@@ -284,7 +169,7 @@
         <w:t>Sevastopol AI.</w:t>
       </w:r>
       <w:r>
-        <w:t xml:space="preserve"> Телеграм-бот по городу. Больше 200 заведений еды, больше 100 локаций, маршруты, события, фото и координаты. Люди заходят с одним практическим вопросом ("где поесть", "где закат") и возвращаются добавить свои места. Это слой "Открыть": бесплатный, без порога входа, работает на утилите, а не на обещании дохода.</w:t>
+        <w:t xml:space="preserve"> Мой телеграм-бот по городу. Больше 200 заведений еды, больше 100 локаций, маршруты, события, фото и координаты. Люди заходят с одним практическим вопросом ("где поесть", "где закат") и возвращаются добавить свои места. Это мой слой "Открыть": бесплатный, без порога входа, работает на утилите, а не на обещании дохода.</w:t>
       </w:r>
     </w:p>
     <w:p>
@@ -298,7 +183,7 @@
         <w:t>City Code.</w:t>
       </w:r>
       <w:r>
-        <w:t xml:space="preserve"> Закрытый круг вокруг Севастополя. Не скидочная карта, а система из шести ключей: Code (свод правил, кто и на каких условиях попадает внутрь), Privileges (привилегии у партнёров), Partner Circle (сами партнёры), Events (закрытые мероприятия), Insights (аналитика), Member Circle (сообщество людей). Партнёры по финансовой инфраструктуре: Hermes Exchange и Небанк. Это слой "Войти": отбор, статус, принадлежность.</w:t>
+        <w:t xml:space="preserve"> Мой закрытый круг вокруг Севастополя. Не скидочная карта, а система из шести ключей: Code (свод правил, кто и на каких условиях попадает внутрь), Privileges (привилегии у партнёров), Partner Circle (сами партнёры), Events (закрытые мероприятия), Insights (аналитика), Member Circle (сообщество людей). Партнёры по финансовой инфраструктуре: Hermes Exchange и Небанк. Это мой слой "Войти": отбор, статус, принадлежность.</w:t>
       </w:r>
     </w:p>
     <w:p>
@@ -312,7 +197,7 @@
         <w:t>Crimea RWA.</w:t>
       </w:r>
       <w:r>
-        <w:t xml:space="preserve"> Проверка гипотезы: можно ли долю реальной городской кассы упаковать в цифровой финансовый актив (ЦФА) по российскому закону 259-ФЗ. Учебный пример на сайте: доля дохода кофейни-партнёра City Code, объём выпуска 10 000 000 рублей, 2 000 единиц номиналом 5 000 рублей, выплаты ежеквартально из выручки точки, погашение 31.12.2028, эмитент ООО-партнёр, оператор (ОИС) из реестра Банка России. Статус размечен честно: учебный макет, не оферта, следующий горизонт. Это слой "Владеть".</w:t>
+        <w:t xml:space="preserve"> Моя проверка гипотезы: можно ли долю реальной городской кассы упаковать в цифровой финансовый актив (ЦФА) по российскому закону 259-ФЗ. Мой учебный пример: доля дохода кофейни-партнёра City Code, объём выпуска 10 000 000 рублей, 2 000 единиц номиналом 5 000 рублей, выплаты ежеквартально из выручки точки, погашение 31.12.2028, эмитент ООО-партнёр, оператор (ОИС) из реестра Банка России. Я честно размечаю статус: учебный макет, не оферта, следующий горизонт. Это мой слой "Владеть".</w:t>
       </w:r>
     </w:p>
     <w:p>
@@ -326,7 +211,7 @@
         <w:t>Курс YuRich RWA.</w:t>
       </w:r>
       <w:r>
-        <w:t xml:space="preserve"> Шесть модулей: старт, что такое RWA, категории активов, инфраструктура, регулирование и СНГ, ликвидность и риски, карта игроков рынка. Без трейдинга и без сигналов, это принципиальная граница: сигналы живут в канале, не в образовательном продукте.</w:t>
+        <w:t xml:space="preserve"> Шесть модулей: старт, что такое RWA, категории активов, инфраструктура, регулирование и СНГ, ликвидность и риски, карта игроков рынка. Без трейдинга и без сигналов, это моя принципиальная граница: сигналы живут в канале, не в образовательном продукте.</w:t>
       </w:r>
     </w:p>
     <w:p>
@@ -354,12 +239,12 @@
         <w:t>Сборка выпуска ЦФА (B2B).</w:t>
       </w:r>
       <w:r>
-        <w:t xml:space="preserve"> Платная услуга для бизнеса: довести реальный актив (производство, оборудование, аренда, контрактная выручка) до выпуска ЦФА через лицензированного оператора. Юрич прямо пишет: "Я не оператор и не биржа", деньги инвестора идут на счёт эмитента через площадку, не на счёт Юрича. Прайсинг прозрачный: созвон бесплатно, разбор 80 000 рублей, сборка 250 - 400 тысяч, посадка на площадку 200 - 350 тысяч плюс комиссия оператора, сопровождение сбора 3 - 7% с суммы, которая реально дошла до эмитента, дальнейшее сопровождение 40 000 рублей в месяц.</w:t>
-      </w:r>
-    </w:p>
-    <w:p>
-      <w:r>
-        <w:t>Три главных отличия от типичного RWA-контента в LinkedIn, на которых и нужно строить позиционирование:</w:t>
+        <w:t xml:space="preserve"> Моя платная услуга для бизнеса: довести реальный актив (производство, оборудование, аренда, контрактная выручка) до выпуска ЦФА через лицензированного оператора. Я прямо говорю клиентам: "Я не оператор и не биржа", деньги инвестора идут на счёт эмитента через площадку, не на мой счёт. Мой прайсинг прозрачный: созвон бесплатно, разбор 80 000 рублей, сборка 250 - 400 тысяч, посадка на площадку 200 - 350 тысяч плюс комиссия оператора, сопровождение сбора 3 - 7% с суммы, которая реально дошла до эмитента, дальнейшее сопровождение 40 000 рублей в месяц.</w:t>
+      </w:r>
+    </w:p>
+    <w:p>
+      <w:r>
+        <w:t>Три главных отличия, на которых я строю своё позиционирование:</w:t>
       </w:r>
     </w:p>
     <w:p>
@@ -370,25 +255,25 @@
         <w:rPr>
           <w:b/>
         </w:rPr>
-        <w:t>Это не токен-фабрика.</w:t>
-      </w:r>
-      <w:r>
-        <w:t xml:space="preserve"> Юрич явно отказывается быть оператором или биржей. Он структурирует сделку и уходит в сторону. Это противоположность модели "мы выпускаем токен и держим ключи". 2. </w:t>
+        <w:t>Я не токен-фабрика.</w:t>
+      </w:r>
+      <w:r>
+        <w:t xml:space="preserve"> Я явно отказываюсь быть оператором или биржей. Я структурирую сделку и ухожу в сторону. Это противоположность модели "я выпускаю токен и держу ключи". 2. </w:t>
       </w:r>
       <w:r>
         <w:rPr>
           <w:b/>
         </w:rPr>
-        <w:t>Это снизу вверх, а не сверху вниз.</w:t>
-      </w:r>
-      <w:r>
-        <w:t xml:space="preserve"> Институциональный RWA идёт от триллионов (трежерис, частный кредит) к частному инвестору. Юрич идёт от одного города, одной кофейни, одного сообщества к модели, которую потом можно повторить в любом другом городе. 3. </w:t>
+        <w:t>Я иду снизу вверх, а не сверху вниз.</w:t>
+      </w:r>
+      <w:r>
+        <w:t xml:space="preserve"> Институциональный RWA идёт от триллионов (трежерис, частный кредит) к частному инвестору. Я иду от одного города, одной кофейни, одного сообщества к модели, которую потом можно повторить в любом другом городе. 3. </w:t>
       </w:r>
       <w:r>
         <w:rPr>
           <w:b/>
         </w:rPr>
-        <w:t>Это цепочка доверия, а не цепочка хайпа.</w:t>
+        <w:t>Я строю цепочку доверия, а не цепочку хайпа.</w:t>
       </w:r>
       <w:r>
         <w:t xml:space="preserve"> Бесплатная утилита (бот) создаёт доверие и трафик, доверие конвертируется в сообщество (City Code), сообщество конвертируется в капитал (Crimea RWA). Это ближе к логике Y Combinator "do things that don't scale", чем к логике ICO 2021 года.</w:t>
@@ -403,12 +288,7 @@
           <w:color w:val="6E6E6E"/>
           <w:sz w:val="16"/>
         </w:rPr>
-        <w:t>————————————————————</w:t>
-      </w:r>
-    </w:p>
-    <w:p>
-      <w:r>
-        <w:br w:type="page"/>
+        <w:t>..............................</w:t>
       </w:r>
     </w:p>
     <w:p>
@@ -416,12 +296,12 @@
         <w:pStyle w:val="Heading1"/>
       </w:pPr>
       <w:r>
-        <w:t>02. Архитектура Ситикод: как читать стек</w:t>
-      </w:r>
-    </w:p>
-    <w:p>
-      <w:r>
-        <w:t xml:space="preserve">Формула с сайта YurichHub, несущая конструкция всего нарратива: </w:t>
+        <w:t>02. Архитектура Ситикод: как я собираю стек</w:t>
+      </w:r>
+    </w:p>
+    <w:p>
+      <w:r>
+        <w:t xml:space="preserve">Моя несущая формула, вокруг которой строится весь нарратив: </w:t>
       </w:r>
       <w:r>
         <w:rPr>
@@ -435,12 +315,12 @@
     </w:p>
     <w:p>
       <w:r>
-        <w:t>Слой 1. Sevastopol AI отвечает на вопрос "где". Слой 2. City Code отвечает на вопрос "с кем". Слой 3. Crimea RWA отвечает на вопрос "чем я теперь владею". Между слоями нет разрыва: бот бесплатный и открытый, круг закрытый, но доступный по заявке или вкладу в город, владение пока размечено как горизонт, а не продукт, который продаётся здесь и сейчас.</w:t>
-      </w:r>
-    </w:p>
-    <w:p>
-      <w:r>
-        <w:t>Это принципиально отличает Юрича от типичной токенизационной истории, где сначала продают токен, а комьюнити и утилиту обещают потом. Здесь порядок обратный: сначала утилита и комьюнити, потом, когда есть реальная выручка и реальные партнёры, появляется финансовый инструмент под неё. Это и есть содержательный ответ на вопрос "при чём тут RWA": RWA здесь не стартовая точка хайпа, а последняя, самая требовательная ступень доверия.</w:t>
+        <w:t>Слой 1. Sevastopol AI отвечает на вопрос "где". Слой 2. City Code отвечает на вопрос "с кем". Слой 3. Crimea RWA отвечает на вопрос "чем я теперь владею". Между слоями у меня нет разрыва: бот бесплатный и открытый, круг закрытый, но доступный по заявке или вкладу в город, владение пока размечено как горизонт, а не продукт, который продаётся здесь и сейчас.</w:t>
+      </w:r>
+    </w:p>
+    <w:p>
+      <w:r>
+        <w:t>Это принципиально отличает меня от типичной токенизационной истории, где сначала продают токен, а комьюнити и утилиту обещают потом. У меня порядок обратный: сначала утилита и комьюнити, потом, когда есть реальная выручка и реальные партнёры, появляется финансовый инструмент под неё. Это и есть мой содержательный ответ на вопрос "при чём тут RWA": у меня RWA не стартовая точка хайпа, а последняя, самая требовательная ступень доверия.</w:t>
       </w:r>
     </w:p>
     <w:p>
@@ -452,12 +332,7 @@
           <w:color w:val="6E6E6E"/>
           <w:sz w:val="16"/>
         </w:rPr>
-        <w:t>————————————————————</w:t>
-      </w:r>
-    </w:p>
-    <w:p>
-      <w:r>
-        <w:br w:type="page"/>
+        <w:t>..............................</w:t>
       </w:r>
     </w:p>
     <w:p>
@@ -480,17 +355,17 @@
     </w:p>
     <w:p>
       <w:r>
-        <w:t>Это создаёт содержательный вакуум, в который и целится Юрич. Институциональный RWA отвечает на вопрос "как упаковать триллион долларов трежерис для фонда". Проект Юрича отвечает на другой вопрос: "как упаковать выручку одной реальной точки в одном реальном городе так, чтобы в неё можно было буквально зайти соседу по улице". Это два разных рынка, которые пересекаются только в слове "токенизация", но решают противоположные задачи: институциональный RWA ищет масштаб и ликвидность, городской RWA ищет доверие и повторяемость.</w:t>
-      </w:r>
-    </w:p>
-    <w:p>
-      <w:r>
-        <w:t>В России правовая рамка для розничной токенизации это не "блокчейн и смартконтракт", а закон 259-ФЗ и цифровые финансовые активы (ЦФА): запись о праве у оператора информационной системы (ОИС) из реестра Банка России. ЦФА в этой модели почти всегда удостоверяет не долю в бизнесе, а денежное требование, право получить выплату по графику. Инвестор не покупает бизнес, он покупает право получить с эмитента деньги. Это принципиально другая конструкция, чем "токен на Ethereum", и именно поэтому Юрич так настойчиво повторяет фразы "я не оператор", "я не биржа", "деньги на мой счёт не идут": в юрисдикции, где именно это определяет, законная сделка перед нами или нет.</w:t>
-      </w:r>
-    </w:p>
-    <w:p>
-      <w:r>
-        <w:t>Для международной LinkedIn-аудитории это и есть самый интересный контринтуитивный факт: пока весь мир обсуждает "ончейн акции" и прямое владение через блокчейн (Securitize, Superstate, Figure), в российской регуляторной модели розничная токенизация реального актива уже является регулируемым продуктом с 2020 года, просто называется иначе и выглядит иначе. Это даёт Юричу редкую позицию: он может говорить про RWA не как евангелист нерегулируемого будущего, а как практик, который уже работает внутри регулируемой рамки и может объяснить её тем, кто смотрит на неё снаружи.</w:t>
+        <w:t>Это создаёт содержательный вакуум, в который я и целюсь. Институциональный RWA отвечает на вопрос "как упаковать триллион долларов трежерис для фонда". Я отвечаю на другой вопрос: "как упаковать выручку одной реальной точки в одном реальном городе так, чтобы в неё можно было буквально зайти соседу по улице". Это два разных рынка, которые пересекаются только в слове "токенизация", но решают противоположные задачи: институциональный RWA ищет масштаб и ликвидность, мой городской RWA ищет доверие и повторяемость.</w:t>
+      </w:r>
+    </w:p>
+    <w:p>
+      <w:r>
+        <w:t>В России правовая рамка для розничной токенизации это не "блокчейн и смартконтракт", а закон 259-ФЗ и цифровые финансовые активы (ЦФА): запись о праве у оператора информационной системы (ОИС) из реестра Банка России. ЦФА в моей модели почти всегда удостоверяет не долю в бизнесе, а денежное требование, право получить выплату по графику. Инвестор не покупает бизнес, он покупает право получить с эмитента деньги. Это принципиально другая конструкция, чем "токен на Ethereum", и именно поэтому я так настойчиво повторяю фразы "я не оператор", "я не биржа", "деньги на мой счёт не идут": в юрисдикции, где именно это определяет, законная сделка перед нами или нет.</w:t>
+      </w:r>
+    </w:p>
+    <w:p>
+      <w:r>
+        <w:t>Для международной LinkedIn-аудитории это и есть самый интересный контринтуитивный факт, который я могу показать: пока весь мир обсуждает "ончейн акции" и прямое владение через блокчейн (Securitize, Superstate, Figure), в российской регуляторной модели розничная токенизация реального актива уже является регулируемым продуктом с 2020 года, просто называется иначе и выглядит иначе. Это даёт мне редкую позицию: я могу говорить про RWA не как евангелист нерегулируемого будущего, а как практик, который уже работает внутри регулируемой рамки и может объяснить её тем, кто смотрит на неё снаружи.</w:t>
       </w:r>
     </w:p>
     <w:p>
@@ -502,12 +377,7 @@
           <w:color w:val="6E6E6E"/>
           <w:sz w:val="16"/>
         </w:rPr>
-        <w:t>————————————————————</w:t>
-      </w:r>
-    </w:p>
-    <w:p>
-      <w:r>
-        <w:br w:type="page"/>
+        <w:t>..............................</w:t>
       </w:r>
     </w:p>
     <w:p>
@@ -515,12 +385,12 @@
         <w:pStyle w:val="Heading1"/>
       </w:pPr>
       <w:r>
-        <w:t>04. Карта мирового RWA: где стоит Юрич</w:t>
-      </w:r>
-    </w:p>
-    <w:p>
-      <w:r>
-        <w:t>Чтобы позиционирование звучало убедительно на международной арене, Юрича нужно разместить на карте, а не представлять в вакууме. Ниже сравнение по трём осям: масштаб актива, направление движения капитала, роль основателя.</w:t>
+        <w:t>04. Карта мирового RWA: где стою я</w:t>
+      </w:r>
+    </w:p>
+    <w:p>
+      <w:r>
+        <w:t>Чтобы моё позиционирование звучало убедительно на международной арене, мне нужно разместить себя на карте, а не представлять себя в вакууме. Ниже сравнение по трём осям: масштаб актива, направление движения капитала, роль основателя.</w:t>
       </w:r>
     </w:p>
     <w:tbl>
@@ -849,7 +719,7 @@
               <w:rPr>
                 <w:sz w:val="17"/>
               </w:rPr>
-              <w:t>Юрич, Crimea RWA</w:t>
+              <w:t>Я, Crimea RWA</w:t>
             </w:r>
           </w:p>
         </w:tc>
@@ -891,7 +761,7 @@
               <w:rPr>
                 <w:sz w:val="17"/>
               </w:rPr>
-              <w:t>Один человек, публичное лицо, воронка строится вокруг доверия к основателю</w:t>
+              <w:t>Один человек, я сам публичное лицо, моя воронка строится вокруг доверия ко мне</w:t>
             </w:r>
           </w:p>
         </w:tc>
@@ -900,7 +770,7 @@
     <w:p/>
     <w:p>
       <w:r>
-        <w:t>Вывод для позиционирования: ни один крупный игрок сегодня не строит RWA снизу, от одного города и его повседневной экономики, и ни один крупный игрок не делает основателя центральным публичным лицом воронки "узнал - вошёл - владею". Юрич может занять нишу "RWA одного города как воспроизводимый плейбук" и говорить с позиции практика, а не теоретика: у него уже есть бот с реальными пользователями, круг с реальными партнёрами и платная услуга для бизнеса с реальным прайсингом. Это сильнее, чем позиция "у меня есть идея", и слабее, чем позиция институционала с миллиардами под управлением, поэтому голос должен быть голосом building in public: честные цифры, честные отказы, честная скорость.</w:t>
+        <w:t>Вывод для моего позиционирования: ни один крупный игрок сегодня не строит RWA снизу, от одного города и его повседневной экономики, и ни один крупный игрок не делает основателя центральным публичным лицом воронки "узнал - вошёл - владею". Я могу занять нишу "RWA одного города как воспроизводимый плейбук" и говорить с позиции практика, а не теоретика: у меня уже есть бот с реальными пользователями, круг с реальными партнёрами и платная услуга для бизнеса с реальным прайсингом. Это сильнее, чем позиция "у меня есть идея", и слабее, чем позиция институционала с миллиардами под управлением, поэтому мой голос должен быть голосом building in public: честные цифры, честные отказы, честная скорость.</w:t>
       </w:r>
     </w:p>
     <w:p>
@@ -912,12 +782,7 @@
           <w:color w:val="6E6E6E"/>
           <w:sz w:val="16"/>
         </w:rPr>
-        <w:t>————————————————————</w:t>
-      </w:r>
-    </w:p>
-    <w:p>
-      <w:r>
-        <w:br w:type="page"/>
+        <w:t>..............................</w:t>
       </w:r>
     </w:p>
     <w:p>
@@ -925,7 +790,7 @@
         <w:pStyle w:val="Heading1"/>
       </w:pPr>
       <w:r>
-        <w:t>05. SWOT Юрича как публичной персоны RWA</w:t>
+        <w:t>05. Мой SWOT как публичной персоны RWA</w:t>
       </w:r>
     </w:p>
     <w:tbl>
@@ -1000,7 +865,7 @@
               <w:rPr>
                 <w:sz w:val="17"/>
               </w:rPr>
-              <w:t>Масштаб пока несопоставим с институциональными игроками, это нужно признавать, а не маскировать</w:t>
+              <w:t>Мой масштаб пока несопоставим с институциональными игроками, я должен это признавать, а не маскировать</w:t>
             </w:r>
           </w:p>
         </w:tc>
@@ -1030,7 +895,7 @@
               <w:rPr>
                 <w:sz w:val="17"/>
               </w:rPr>
-              <w:t>Севастополь и Крым несут geopolitical чувствительность для части международной аудитории и могут закрыть доступ к иностранным инвесторам и части платформ</w:t>
+              <w:t>Севастополь и Крым несут geopolitical чувствительность для части международной аудитории и могут закрыть мне доступ к иностранным инвесторам и части платформ</w:t>
             </w:r>
           </w:p>
         </w:tc>
@@ -1060,7 +925,7 @@
               <w:rPr>
                 <w:sz w:val="17"/>
               </w:rPr>
-              <w:t>Контент пока существует в основном на русском языке, перевод и адаптация голоса на английский требуют дисциплины</w:t>
+              <w:t>Мой контент пока существует в основном на русском языке, перевод и адаптация голоса на английский требуют от меня дисциплины</w:t>
             </w:r>
           </w:p>
         </w:tc>
@@ -1090,7 +955,7 @@
               <w:rPr>
                 <w:sz w:val="17"/>
               </w:rPr>
-              <w:t>Один человек на всю операционную и публичную нагрузку, риск выгорания и нерегулярности публикаций</w:t>
+              <w:t>Я один на всю операционную и публичную нагрузку, риск выгорания и нерегулярности публикаций</w:t>
             </w:r>
           </w:p>
         </w:tc>
@@ -1106,7 +971,7 @@
               <w:rPr>
                 <w:sz w:val="17"/>
               </w:rPr>
-              <w:t>Сильные перевод: тезисы, реальный прайсинг услуги для бизнеса, готовые кейсы разбора</w:t>
+              <w:t>Сильные переводимые активы: тезисы, реальный прайсинг услуги для бизнеса, готовые кейсы разбора</w:t>
             </w:r>
           </w:p>
         </w:tc>
@@ -1120,7 +985,7 @@
               <w:rPr>
                 <w:sz w:val="17"/>
               </w:rPr>
-              <w:t>Нет пока ни одного завершённого реального (не учебного) выпуска ЦФА, что ограничивает доказательную базу</w:t>
+              <w:t>У меня нет пока ни одного завершённого реального (не учебного) выпуска ЦФА, что ограничивает мою доказательную базу</w:t>
             </w:r>
           </w:p>
         </w:tc>
@@ -1185,7 +1050,7 @@
               <w:rPr>
                 <w:sz w:val="17"/>
               </w:rPr>
-              <w:t>Глобальная усталость от институционального RWA-нарратива создаёт спрос на "человеческую" альтернативную историю</w:t>
+              <w:t>Глобальная усталость от институционального RWA-нарратива создаёт спрос на мою "человеческую" альтернативную историю</w:t>
             </w:r>
           </w:p>
         </w:tc>
@@ -1199,7 +1064,7 @@
               <w:rPr>
                 <w:sz w:val="17"/>
               </w:rPr>
-              <w:t>Регуляторная среда 259-ФЗ и смежных законов может измениться быстрее, чем контент-план</w:t>
+              <w:t>Регуляторная среда 259-ФЗ и смежных законов может измениться быстрее, чем мой контент-план</w:t>
             </w:r>
           </w:p>
         </w:tc>
@@ -1229,7 +1094,7 @@
               <w:rPr>
                 <w:sz w:val="17"/>
               </w:rPr>
-              <w:t>Риск, что международная аудитория спутает образовательный тон с предложением инвестировать, с юридическими последствиями</w:t>
+              <w:t>Риск, что международная аудитория спутает мой образовательный тон с предложением инвестировать, с юридическими последствиями для меня</w:t>
             </w:r>
           </w:p>
         </w:tc>
@@ -1259,7 +1124,7 @@
               <w:rPr>
                 <w:sz w:val="17"/>
               </w:rPr>
-              <w:t>Копирование модели другими городами или блогерами быстрее, чем Юрич успеет закрепить авторство идеи</w:t>
+              <w:t>Копирование моей модели другими городами или блогерами быстрее, чем я успею закрепить за собой авторство идеи</w:t>
             </w:r>
           </w:p>
         </w:tc>
@@ -1275,7 +1140,7 @@
               <w:rPr>
                 <w:sz w:val="17"/>
               </w:rPr>
-              <w:t>Партнёрства с Hermes Exchange и Небанк дают повод для совместного контента и перекрёстной аудитории</w:t>
+              <w:t>Партнёрства с Hermes Exchange и Небанк дают мне повод для совместного контента и перекрёстной аудитории</w:t>
             </w:r>
           </w:p>
         </w:tc>
@@ -1289,7 +1154,7 @@
               <w:rPr>
                 <w:sz w:val="17"/>
               </w:rPr>
-              <w:t>Сарказм и недоверие крипто-аудитории к "ещё одному RWA проекту", если не подкреплять словами делами и цифрами</w:t>
+              <w:t>Сарказм и недоверие крипто-аудитории к "ещё одному RWA проекту", если я не буду подкреплять слова делами и цифрами</w:t>
             </w:r>
           </w:p>
         </w:tc>
@@ -1305,12 +1170,7 @@
           <w:color w:val="6E6E6E"/>
           <w:sz w:val="16"/>
         </w:rPr>
-        <w:t>————————————————————</w:t>
-      </w:r>
-    </w:p>
-    <w:p>
-      <w:r>
-        <w:br w:type="page"/>
+        <w:t>..............................</w:t>
       </w:r>
     </w:p>
     <w:p>
@@ -1318,7 +1178,7 @@
         <w:pStyle w:val="Heading1"/>
       </w:pPr>
       <w:r>
-        <w:t>06. Аудитория LinkedIn: шесть сегментов</w:t>
+        <w:t>06. Моя аудитория на LinkedIn: шесть сегментов</w:t>
       </w:r>
     </w:p>
     <w:p>
@@ -1332,7 +1192,7 @@
         <w:t>Строители RWA-инфраструктуры.</w:t>
       </w:r>
       <w:r>
-        <w:t xml:space="preserve"> Команды Securitize, Ondo, Centrifuge, Superstate, Plume и похожих протоколов. Для них Юрич интересен как practitioner нишевого кейса, потенциальный партнёр по интеграции или просто источник незашоренного взгляда на розничную токенизацию вне США. 2. </w:t>
+        <w:t xml:space="preserve"> Команды Securitize, Ondo, Centrifuge, Superstate, Plume и похожих протоколов. Для них я интересен как practitioner нишевого кейса, потенциальный партнёр по интеграции или просто источник незашоренного взгляда на розничную токенизацию вне США. 2. </w:t>
       </w:r>
       <w:r>
         <w:rPr>
@@ -1341,7 +1201,7 @@
         <w:t>Институциональные аллокаторы и family offices.</w:t>
       </w:r>
       <w:r>
-        <w:t xml:space="preserve"> Люди, которые уже распределяют капитал в трежерис-токены и присматриваются к альтернативным RWA классам. Их цена входа высокая, но их интересует именно строгость структуры, а не хайп: сюда и бьёт фраза "я не оператор и не биржа". 3. </w:t>
+        <w:t xml:space="preserve"> Люди, которые уже распределяют капитал в трежерис-токены и присматриваются к альтернативным RWA классам. Их цена входа высокая, но их интересует именно строгость структуры, а не хайп: сюда и бьёт моя фраза "я не оператор и не биржа". 3. </w:t>
       </w:r>
       <w:r>
         <w:rPr>
@@ -1350,7 +1210,7 @@
         <w:t>Венчурные инвесторы и ангелы в фин-инфраструктуре.</w:t>
       </w:r>
       <w:r>
-        <w:t xml:space="preserve"> Ищут founder-market fit и defensible thesis. Для них ключевой сигнал: Юрич уже монетизирует (платная сборка ЦФА) до привлечения венчурных денег, это редкий и сильный сигнал дисциплины. 4. </w:t>
+        <w:t xml:space="preserve"> Ищут founder-market fit и defensible thesis. Для них ключевой сигнал: я уже монетизирую (платная сборка ЦФА) до привлечения венчурных денег, это редкий и сильный сигнал дисциплины. 4. </w:t>
       </w:r>
       <w:r>
         <w:rPr>
@@ -1359,7 +1219,7 @@
         <w:t>Юристы, комплаенс и регуляторные эксперты цифровых активов.</w:t>
       </w:r>
       <w:r>
-        <w:t xml:space="preserve"> Эта аудитория наиболее придирчива и наиболее ценна для доверия: пост про механику 259-ФЗ, написанный точно и без прикрас, конвертирует именно их в комментаторов и амплифайеров. 5. </w:t>
+        <w:t xml:space="preserve"> Эта аудитория наиболее придирчива и наиболее ценна для моего доверия: пост про механику 259-ФЗ, написанный точно и без прикрас, конвертирует именно их в комментаторов и амплифайеров. 5. </w:t>
       </w:r>
       <w:r>
         <w:rPr>
@@ -1368,7 +1228,7 @@
         <w:t>Специалисты по urban tech, smart city и локальной экономике.</w:t>
       </w:r>
       <w:r>
-        <w:t xml:space="preserve"> Менее очевидный, но менее конкурентный сегмент. Эта аудитория ещё не видела RWA применительно к urban economy и реагирует с интересом новизны, а не скепсисом ветерана крипто-циклов. 6. </w:t>
+        <w:t xml:space="preserve"> Менее очевидный, но менее конкурентный сегмент для меня. Эта аудитория ещё не видела RWA применительно к urban economy и реагирует с интересом новизны, а не скепсисом ветерана крипто-циклов. 6. </w:t>
       </w:r>
       <w:r>
         <w:rPr>
@@ -1377,12 +1237,12 @@
         <w:t>Web3-фаундеры и билдеры, переходящие из Crypto Twitter на LinkedIn.</w:t>
       </w:r>
       <w:r>
-        <w:t xml:space="preserve"> В 2025-2026 году заметная миграция зрелой крипто-аудитории на LinkedIn в поисках более профессионального тона. Это естественная домашняя аудитория для building-in-public историй.</w:t>
-      </w:r>
-    </w:p>
-    <w:p>
-      <w:r>
-        <w:t xml:space="preserve">Отдельное методологическое замечание: учитывая санкционный контекст вокруг Крыма и Севастополя, контент для международной аудитории LinkedIn должен быть выстроен как </w:t>
+        <w:t xml:space="preserve"> В 2025-2026 году заметная миграция зрелой крипто-аудитории на LinkedIn в поисках более профессионального тона. Это моя естественная домашняя аудитория для building-in-public историй.</w:t>
+      </w:r>
+    </w:p>
+    <w:p>
+      <w:r>
+        <w:t xml:space="preserve">Отдельное замечание, которое я держу в голове: учитывая санкционный контекст вокруг Крыма и Севастополя, мой контент для международной аудитории LinkedIn должен быть выстроен как </w:t>
       </w:r>
       <w:r>
         <w:rPr>
@@ -1391,7 +1251,7 @@
         <w:t>thought leadership и демонстрация плейбука</w:t>
       </w:r>
       <w:r>
-        <w:t>, а не как приглашение иностранных инвесторов участвовать в конкретных выпусках ЦФА. Это не только юридически аккуратнее, но и стратегически сильнее: цель постов на английском - закрепить за Юричем авторство идеи "город как RWA-актив" на международной арене, а не продавать доли неквалифицированным иностранным инвесторам, которым это физически недоступно. Деньги по-прежнему зарабатываются на услуге сборки ЦФА для бизнеса (в основном русскоязычный, региональный клиент) и на репутационном капитале, который потом конвертируется в партнёрства, выступления, консультирование и, возможно, экспорт модели в другие юрисдикции.</w:t>
+        <w:t>, а не как приглашение иностранных инвесторов участвовать в конкретных выпусках ЦФА. Это не только юридически аккуратнее для меня, но и стратегически сильнее: цель моих постов на английском - закрепить за мной авторство идеи "город как RWA-актив" на международной арене, а не продавать доли неквалифицированным иностранным инвесторам, которым это физически недоступно. Деньги я по-прежнему зарабатываю на услуге сборки ЦФА для бизнеса (в основном русскоязычный, региональный клиент) и на репутационном капитале, который потом конвертирую в партнёрства, выступления, консультирование и, возможно, в экспорт модели в другие юрисдикции.</w:t>
       </w:r>
     </w:p>
     <w:p>
@@ -1403,12 +1263,7 @@
           <w:color w:val="6E6E6E"/>
           <w:sz w:val="16"/>
         </w:rPr>
-        <w:t>————————————————————</w:t>
-      </w:r>
-    </w:p>
-    <w:p>
-      <w:r>
-        <w:br w:type="page"/>
+        <w:t>..............................</w:t>
       </w:r>
     </w:p>
     <w:p>
@@ -1505,7 +1360,7 @@
         <w:t>Ссылки снижают охват.</w:t>
       </w:r>
       <w:r>
-        <w:t xml:space="preserve"> LinkedIn придерживает посты с внешней ссылкой в теле поста. Рабочий приём: ссылку выносить в первый комментарий сразу после публикации.</w:t>
+        <w:t xml:space="preserve"> LinkedIn придерживает посты с внешней ссылкой в теле поста. Мой рабочий приём: ссылку выношу в первый комментарий сразу после публикации.</w:t>
       </w:r>
     </w:p>
     <w:p>
@@ -1519,7 +1374,7 @@
         <w:t>Документ-карусель (PDF-слайды) и личное видео сейчас работают сильнее, чем просто картинка.</w:t>
       </w:r>
       <w:r>
-        <w:t xml:space="preserve"> Для нишевой образовательной темы вроде RWA это особенно важно: карусель позволяет объяснить механику без потери внимания на пятой строке текста.</w:t>
+        <w:t xml:space="preserve"> Для нишевой образовательной темы вроде RWA это особенно важно: карусель позволяет мне объяснить механику без потери внимания на пятой строке текста.</w:t>
       </w:r>
     </w:p>
     <w:p>
@@ -1547,7 +1402,7 @@
         <w:t>Комментарии в первый час решают многое.</w:t>
       </w:r>
       <w:r>
-        <w:t xml:space="preserve"> Алгоритм усиливает посты, которые получают быстрый отклик. Автору стоит закладывать 30-60 минут после публикации на личные ответы в комментариях.</w:t>
+        <w:t xml:space="preserve"> Алгоритм усиливает посты, которые получают быстрый отклик. Я закладываю 30-60 минут после публикации на личные ответы в комментариях.</w:t>
       </w:r>
     </w:p>
     <w:p>
@@ -1566,7 +1421,7 @@
     </w:p>
     <w:p>
       <w:r>
-        <w:t>Эти правила полностью совместимы с голосом Юрича: он и так пишет сухо, цифрами, без восторженных прилагательных, с явными отказами и границами. Задача контент-плана не "придумать новый голос под LinkedIn", а грамотно нарезать уже существующий голос в формат, который любит платформа.</w:t>
+        <w:t>Эти правила полностью совместимы с моим голосом: я и так пишу сухо, цифрами, без восторженных прилагательных, с явными отказами и границами. Моя задача не "придумать новый голос под LinkedIn", а грамотно нарезать уже существующий голос в формат, который любит платформа.</w:t>
       </w:r>
     </w:p>
     <w:p>
@@ -1578,12 +1433,7 @@
           <w:color w:val="6E6E6E"/>
           <w:sz w:val="16"/>
         </w:rPr>
-        <w:t>————————————————————</w:t>
-      </w:r>
-    </w:p>
-    <w:p>
-      <w:r>
-        <w:br w:type="page"/>
+        <w:t>..............................</w:t>
       </w:r>
     </w:p>
     <w:p>
@@ -1591,7 +1441,7 @@
         <w:pStyle w:val="Heading1"/>
       </w:pPr>
       <w:r>
-        <w:t>08. Контентные пиллары</w:t>
+        <w:t>08. Мои контентные пиллары</w:t>
       </w:r>
     </w:p>
     <w:tbl>
@@ -1670,7 +1520,7 @@
               <w:rPr>
                 <w:sz w:val="17"/>
               </w:rPr>
-              <w:t>P1. Кто такой Юрич</w:t>
+              <w:t>P1. Кто я</w:t>
             </w:r>
           </w:p>
         </w:tc>
@@ -1772,7 +1622,7 @@
               <w:rPr>
                 <w:sz w:val="17"/>
               </w:rPr>
-              <w:t>Как устроен стек бот-круг-владение, почему это системно</w:t>
+              <w:t>Как устроен мой стек бот-круг-владение, почему это системно</w:t>
             </w:r>
           </w:p>
         </w:tc>
@@ -1846,7 +1696,7 @@
               <w:rPr>
                 <w:sz w:val="17"/>
               </w:rPr>
-              <w:t>P5. Публичная разработка</w:t>
+              <w:t>P5. Моя публичная разработка</w:t>
             </w:r>
           </w:p>
         </w:tc>
@@ -1860,7 +1710,7 @@
               <w:rPr>
                 <w:sz w:val="17"/>
               </w:rPr>
-              <w:t>Реальные цифры, отказы, процесс вживую</w:t>
+              <w:t>Реальные цифры, отказы, мой процесс вживую</w:t>
             </w:r>
           </w:p>
         </w:tc>
@@ -1934,12 +1784,7 @@
           <w:color w:val="6E6E6E"/>
           <w:sz w:val="16"/>
         </w:rPr>
-        <w:t>————————————————————</w:t>
-      </w:r>
-    </w:p>
-    <w:p>
-      <w:r>
-        <w:br w:type="page"/>
+        <w:t>..............................</w:t>
       </w:r>
     </w:p>
     <w:p>
@@ -1947,12 +1792,12 @@
         <w:pStyle w:val="Heading1"/>
       </w:pPr>
       <w:r>
-        <w:t>09. Контент-план на 16 постов, 5 недель</w:t>
-      </w:r>
-    </w:p>
-    <w:p>
-      <w:r>
-        <w:t xml:space="preserve">Темп: 3-4 поста в неделю, понедельник/среда/пятница плюс один бонусный пост на неделях с двумя пилларами. Формат ротируется: текст, карусель-документ, карточка с цифрами (использовать готовый генератор обложек </w:t>
+        <w:t>09. Мой контент-план на 16 постов, 5 недель</w:t>
+      </w:r>
+    </w:p>
+    <w:p>
+      <w:r>
+        <w:t xml:space="preserve">Темп: 3-4 поста в неделю, понедельник/среда/пятница плюс один бонусный пост на неделях с двумя пилларами. Формат ротируется: текст, карусель-документ, карточка с цифрами (использовать мой готовый генератор обложек </w:t>
       </w:r>
       <w:r>
         <w:rPr>
@@ -3706,7 +3551,7 @@
     <w:p/>
     <w:p>
       <w:r>
-        <w:t xml:space="preserve">Рекомендации по CTA в комментариях: ссылки на бот, курс или офер ЦФА выносить в первый комментарий, в самом посте - приглашение к разговору ("какой город по-твоему первый повторит это", "что бы ты спросил у оператора ЦФА", "согласен или я ошибаюсь"). Хештеги использовать точечно: </w:t>
+        <w:t xml:space="preserve">Мои рекомендации по CTA в комментариях: ссылки на бот, курс или офер ЦФА я выношу в первый комментарий, в самом посте оставляю приглашение к разговору ("какой город по-твоему первый повторит это", "что бы ты спросил у оператора ЦФА", "согласен или я ошибаюсь"). Хештеги использую точечно: </w:t>
       </w:r>
       <w:r>
         <w:rPr>
@@ -3748,12 +3593,7 @@
           <w:color w:val="6E6E6E"/>
           <w:sz w:val="16"/>
         </w:rPr>
-        <w:t>————————————————————</w:t>
-      </w:r>
-    </w:p>
-    <w:p>
-      <w:r>
-        <w:br w:type="page"/>
+        <w:t>..............................</w:t>
       </w:r>
     </w:p>
     <w:p>
@@ -3779,7 +3619,7 @@
           <w:color w:val="6E6E6E"/>
           <w:sz w:val="18"/>
         </w:rPr>
-        <w:t>P1 · Кто такой Юрич · Формат: Текст · Хук: История</w:t>
+        <w:t>P1 · Кто я · Формат: Текст · Хук: История</w:t>
       </w:r>
     </w:p>
     <w:p>
@@ -3838,7 +3678,7 @@
           <w:color w:val="6E6E6E"/>
           <w:sz w:val="16"/>
         </w:rPr>
-        <w:t>————————————————————</w:t>
+        <w:t>..............................</w:t>
       </w:r>
     </w:p>
     <w:p>
@@ -3915,7 +3755,7 @@
           <w:color w:val="6E6E6E"/>
           <w:sz w:val="16"/>
         </w:rPr>
-        <w:t>————————————————————</w:t>
+        <w:t>..............................</w:t>
       </w:r>
     </w:p>
     <w:p>
@@ -4002,7 +3842,7 @@
           <w:color w:val="6E6E6E"/>
           <w:sz w:val="16"/>
         </w:rPr>
-        <w:t>————————————————————</w:t>
+        <w:t>..............................</w:t>
       </w:r>
     </w:p>
     <w:p>
@@ -4020,7 +3860,7 @@
           <w:color w:val="6E6E6E"/>
           <w:sz w:val="18"/>
         </w:rPr>
-        <w:t>P1 · Кто такой Юрич · Формат: Текст · Хук: История</w:t>
+        <w:t>P1 · Кто я · Формат: Текст · Хук: История</w:t>
       </w:r>
     </w:p>
     <w:p>
@@ -4084,7 +3924,7 @@
           <w:color w:val="6E6E6E"/>
           <w:sz w:val="16"/>
         </w:rPr>
-        <w:t>————————————————————</w:t>
+        <w:t>..............................</w:t>
       </w:r>
     </w:p>
     <w:p>
@@ -4171,7 +4011,7 @@
           <w:color w:val="6E6E6E"/>
           <w:sz w:val="16"/>
         </w:rPr>
-        <w:t>————————————————————</w:t>
+        <w:t>..............................</w:t>
       </w:r>
     </w:p>
     <w:p>
@@ -4253,7 +4093,7 @@
           <w:color w:val="6E6E6E"/>
           <w:sz w:val="16"/>
         </w:rPr>
-        <w:t>————————————————————</w:t>
+        <w:t>..............................</w:t>
       </w:r>
     </w:p>
     <w:p>
@@ -4330,7 +4170,7 @@
           <w:color w:val="6E6E6E"/>
           <w:sz w:val="16"/>
         </w:rPr>
-        <w:t>————————————————————</w:t>
+        <w:t>..............................</w:t>
       </w:r>
     </w:p>
     <w:p>
@@ -4407,7 +4247,7 @@
           <w:color w:val="6E6E6E"/>
           <w:sz w:val="16"/>
         </w:rPr>
-        <w:t>————————————————————</w:t>
+        <w:t>..............................</w:t>
       </w:r>
     </w:p>
     <w:p>
@@ -4479,7 +4319,7 @@
           <w:color w:val="6E6E6E"/>
           <w:sz w:val="16"/>
         </w:rPr>
-        <w:t>————————————————————</w:t>
+        <w:t>..............................</w:t>
       </w:r>
     </w:p>
     <w:p>
@@ -4556,7 +4396,7 @@
           <w:color w:val="6E6E6E"/>
           <w:sz w:val="16"/>
         </w:rPr>
-        <w:t>————————————————————</w:t>
+        <w:t>..............................</w:t>
       </w:r>
     </w:p>
     <w:p>
@@ -4633,7 +4473,7 @@
           <w:color w:val="6E6E6E"/>
           <w:sz w:val="16"/>
         </w:rPr>
-        <w:t>————————————————————</w:t>
+        <w:t>..............................</w:t>
       </w:r>
     </w:p>
     <w:p>
@@ -4710,7 +4550,7 @@
           <w:color w:val="6E6E6E"/>
           <w:sz w:val="16"/>
         </w:rPr>
-        <w:t>————————————————————</w:t>
+        <w:t>..............................</w:t>
       </w:r>
     </w:p>
     <w:p>
@@ -4728,7 +4568,7 @@
           <w:color w:val="6E6E6E"/>
           <w:sz w:val="18"/>
         </w:rPr>
-        <w:t>P1 · Кто такой Юрич · Формат: Текст · Хук: Контринтуитив</w:t>
+        <w:t>P1 · Кто я · Формат: Текст · Хук: Контринтуитив</w:t>
       </w:r>
     </w:p>
     <w:p>
@@ -4787,7 +4627,7 @@
           <w:color w:val="6E6E6E"/>
           <w:sz w:val="16"/>
         </w:rPr>
-        <w:t>————————————————————</w:t>
+        <w:t>..............................</w:t>
       </w:r>
     </w:p>
     <w:p>
@@ -4864,7 +4704,7 @@
           <w:color w:val="6E6E6E"/>
           <w:sz w:val="16"/>
         </w:rPr>
-        <w:t>————————————————————</w:t>
+        <w:t>..............................</w:t>
       </w:r>
     </w:p>
     <w:p>
@@ -4941,7 +4781,7 @@
           <w:color w:val="6E6E6E"/>
           <w:sz w:val="16"/>
         </w:rPr>
-        <w:t>————————————————————</w:t>
+        <w:t>..............................</w:t>
       </w:r>
     </w:p>
     <w:p>
@@ -5018,12 +4858,7 @@
           <w:color w:val="6E6E6E"/>
           <w:sz w:val="16"/>
         </w:rPr>
-        <w:t>————————————————————</w:t>
-      </w:r>
-    </w:p>
-    <w:p>
-      <w:r>
-        <w:br w:type="page"/>
+        <w:t>..............................</w:t>
       </w:r>
     </w:p>
     <w:p>
@@ -5031,7 +4866,7 @@
         <w:pStyle w:val="Heading1"/>
       </w:pPr>
       <w:r>
-        <w:t>11. Риски, оговорки, модерация</w:t>
+        <w:t>11. Мои риски, оговорки, модерация</w:t>
       </w:r>
     </w:p>
     <w:p>
@@ -5039,7 +4874,7 @@
         <w:pStyle w:val="ListBullet"/>
       </w:pPr>
       <w:r>
-        <w:t>Каждый пост про Crimea RWA и ЦФА должен нести явную пометку: учебный пример, не оферта, не инвестиционная рекомендация. Это не формальность, это юридическая граница, которую сам Юрич проводит на сайте, и её нельзя стирать ради вирусности.</w:t>
+        <w:t>Каждый пост про Crimea RWA и ЦФА несёт у меня явную пометку: учебный пример, не оферта, не инвестиционная рекомендация. Это не формальность, это моя юридическая граница, и я не стираю её ради вирусности.</w:t>
       </w:r>
     </w:p>
     <w:p>
@@ -5047,7 +4882,7 @@
         <w:pStyle w:val="ListBullet"/>
       </w:pPr>
       <w:r>
-        <w:t>В комментариях на английском языке стоит заранее подготовить короткий шаблон ответа на вопрос "как мне как иностранцу в это вложиться": честный ответ - "сейчас это не предложение для международных инвесторов, это демонстрация модели, которую можно повторить в вашей юрисдикции", без попытки обойти вопрос.</w:t>
+        <w:t>В комментариях на английском языке я держу наготове короткий шаблон ответа на вопрос "как мне как иностранцу в это вложиться": честный ответ, который я даю, "сейчас это не предложение для международных инвесторов, это демонстрация модели, которую можно повторить в вашей юрисдикции", без попытки обойти вопрос.</w:t>
       </w:r>
     </w:p>
     <w:p>
@@ -5055,7 +4890,7 @@
         <w:pStyle w:val="ListBullet"/>
       </w:pPr>
       <w:r>
-        <w:t>Не обещать того, чего модуль не делает: курс не даёт сигналов, Sevastopol AI не продаёт ЦФА, City Code не скидочная карта, Crimea RWA пока горизонт, а не действующий публичный выпуск, если это не изменилось на момент публикации.</w:t>
+        <w:t>Я не обещаю того, чего мой модуль не делает: курс не даёт сигналов, Sevastopol AI не продаёт ЦФА, City Code не скидочная карта, Crimea RWA пока горизонт, а не действующий публичный выпуск, если это не изменилось на момент публикации.</w:t>
       </w:r>
     </w:p>
     <w:p>
@@ -5063,7 +4898,7 @@
         <w:pStyle w:val="ListBullet"/>
       </w:pPr>
       <w:r>
-        <w:t>Политическая нейтральность: контент должен говорить о городе, механике и экономике, не о политическом статусе территории. Любые комментарии на эту тему модерировать нейтрально, не ввязываясь в дискуссию, уводить разговор обратно к продукту и механике.</w:t>
+        <w:t>Политическая нейтральность: я говорю о городе, механике и экономике, не о политическом статусе территории. Любые комментарии на эту тему я модерирую нейтрально, не ввязываюсь в дискуссию, увожу разговор обратно к продукту и механике.</w:t>
       </w:r>
     </w:p>
     <w:p>
@@ -5071,7 +4906,7 @@
         <w:pStyle w:val="ListBullet"/>
       </w:pPr>
       <w:r>
-        <w:t>Любое число в посте (пользователи бота, участники City Code, объём выпуска) должно быть реальным на дату публикации. Лучше три честные карточки, чем четыре, одна из которых придумана ради ритма.</w:t>
+        <w:t>Любое число в моём посте (пользователи бота, участники City Code, объём выпуска) реально на дату публикации. Лучше три честные карточки, чем четыре, одна из которых придумана ради ритма.</w:t>
       </w:r>
     </w:p>
     <w:p>
@@ -5083,12 +4918,7 @@
           <w:color w:val="6E6E6E"/>
           <w:sz w:val="16"/>
         </w:rPr>
-        <w:t>————————————————————</w:t>
-      </w:r>
-    </w:p>
-    <w:p>
-      <w:r>
-        <w:br w:type="page"/>
+        <w:t>..............................</w:t>
       </w:r>
     </w:p>
     <w:p>
@@ -5096,7 +4926,7 @@
         <w:pStyle w:val="Heading1"/>
       </w:pPr>
       <w:r>
-        <w:t>12. Позиционирование в трёх предложениях</w:t>
+        <w:t>12. Моё позиционирование в трёх предложениях</w:t>
       </w:r>
     </w:p>
     <w:p>
@@ -5108,12 +4938,12 @@
           <w:i/>
           <w:sz w:val="24"/>
         </w:rPr>
-        <w:t>Юрич (Павел Васильковский, Севастополь) строит первую в России городскую RWA-инфраструктуру снизу вверх: бесплатный ИИ-бот открывает город, закрытый круг City Code превращает интерес в сообщество, а Crimea RWA проверяет, можно ли законно упаковать реальную выручку города в цифровой финансовый актив по 259-ФЗ.</w:t>
-      </w:r>
-    </w:p>
-    <w:p>
-      <w:r>
-        <w:t>Это не токен-фабрика и не крипто-евангелист: Юрич открыто называет себя "не оператор и не биржа", строит на платной услуге для бизнеса раньше венчурных денег и отказывает клиентам, когда цифры не сходятся. Его ставка на 2026-2030 годы: если экономику одного конкретного города можно законно и доверительно упаковать в актив, значит, то же самое можно повторить в любом городе мира, и первым, кто опишет этот плейбук, должен стать он.</w:t>
+        <w:t>Я, Юрич (Павел Васильковский, Севастополь), строю первую в России городскую RWA-инфраструктуру снизу вверх: бесплатный ИИ-бот открывает город, закрытый круг City Code превращает интерес в сообщество, а Crimea RWA проверяет, можно ли законно упаковать реальную выручку города в цифровой финансовый актив по 259-ФЗ.</w:t>
+      </w:r>
+    </w:p>
+    <w:p>
+      <w:r>
+        <w:t>Я не токен-фабрика и не крипто-евангелист: я открыто называю себя "не оператор и не биржа", строю на платной услуге для бизнеса раньше венчурных денег и отказываю клиентам, когда цифры не сходятся. Моя ставка на 2026-2030 годы: если экономику одного конкретного города можно законно и доверительно упаковать в актив, значит, то же самое можно повторить в любом городе мира, и первым, кто опишет этот плейбук, должен стать я.</w:t>
       </w:r>
     </w:p>
     <w:p>
@@ -5139,11 +4969,6 @@
       </w:r>
     </w:p>
     <w:p>
-      <w:r>
-        <w:br w:type="page"/>
-      </w:r>
-    </w:p>
-    <w:p>
       <w:pPr>
         <w:pStyle w:val="Heading1"/>
       </w:pPr>
@@ -5164,81 +4989,26 @@
       </w:r>
     </w:p>
     <w:p>
-      <w:r>
-        <w:br w:type="page"/>
-      </w:r>
-    </w:p>
-    <w:p>
       <w:pPr>
         <w:pStyle w:val="Heading1"/>
       </w:pPr>
       <w:r>
-        <w:t>00. About this document</w:t>
-      </w:r>
-    </w:p>
-    <w:p>
-      <w:r>
-        <w:t>This is working analysis, not a brand book and not a sales brochure. The task: take what already exists under Yurich's build (the YurichHub site, the Sevastopol AI bot, City Code, Crimea RWA, the course, the glossary, the CFA structuring offer), lay it against how the global RWA space actually works, and against how LinkedIn works as a platform, and produce: a) a positioning statement, b) an audience map, c) a calendar, d) 16 ready post texts in Russian and 16 in English.</w:t>
-      </w:r>
-    </w:p>
-    <w:p>
-      <w:r>
-        <w:t xml:space="preserve">Sources: </w:t>
-      </w:r>
-      <w:r>
-        <w:rPr>
-          <w:rFonts w:ascii="Consolas" w:hAnsi="Consolas"/>
-          <w:color w:val="5B7A00"/>
-        </w:rPr>
-        <w:t>index.html</w:t>
-      </w:r>
-      <w:r>
-        <w:t xml:space="preserve">, </w:t>
-      </w:r>
-      <w:r>
-        <w:rPr>
-          <w:rFonts w:ascii="Consolas" w:hAnsi="Consolas"/>
-          <w:color w:val="5B7A00"/>
-        </w:rPr>
-        <w:t>course.html</w:t>
-      </w:r>
-      <w:r>
-        <w:t xml:space="preserve">, </w:t>
-      </w:r>
-      <w:r>
-        <w:rPr>
-          <w:rFonts w:ascii="Consolas" w:hAnsi="Consolas"/>
-          <w:color w:val="5B7A00"/>
-        </w:rPr>
-        <w:t>cfa.html</w:t>
-      </w:r>
-      <w:r>
-        <w:t xml:space="preserve">, </w:t>
-      </w:r>
-      <w:r>
-        <w:rPr>
-          <w:rFonts w:ascii="Consolas" w:hAnsi="Consolas"/>
-          <w:color w:val="5B7A00"/>
-        </w:rPr>
-        <w:t>glossary.html</w:t>
-      </w:r>
-      <w:r>
-        <w:t xml:space="preserve">, the brand canon </w:t>
-      </w:r>
-      <w:r>
-        <w:rPr>
-          <w:rFonts w:ascii="Consolas" w:hAnsi="Consolas"/>
-          <w:color w:val="5B7A00"/>
-        </w:rPr>
-        <w:t>YURICHHUB-STYLE.md</w:t>
-      </w:r>
-      <w:r>
-        <w:t>, widely cited market data on real world asset tokenization in 2025 to 2026, and documented practice on what makes LinkedIn posts perform in 2025 to 2026.</w:t>
-      </w:r>
-    </w:p>
-    <w:p>
-      <w:r>
-        <w:t xml:space="preserve">Every project specific number in this document that depends on live data (bot users, City Code applications, the size of an actual issuance) is marked </w:t>
+        <w:t>00. Why I wrote this</w:t>
+      </w:r>
+    </w:p>
+    <w:p>
+      <w:r>
+        <w:t>This is not a brand book and not a sales brochure. It is my own working analysis before going to LinkedIn.</w:t>
+      </w:r>
+    </w:p>
+    <w:p>
+      <w:r>
+        <w:t>I pulled together what I have already built: a city bot, a closed membership circle, a test CFA issuance, a course, a glossary, and a paid structuring service for businesses. I laid that against how the global RWA space actually works and how LinkedIn works as a platform. The result: a positioning statement, a map of my audience, a publishing calendar, and 16 ready post texts in Russian and 16 in English.</w:t>
+      </w:r>
+    </w:p>
+    <w:p>
+      <w:r>
+        <w:t xml:space="preserve">Every number about my own project that I cannot confirm today (bot users, City Code applications, the size of a real issuance) is marked </w:t>
       </w:r>
       <w:r>
         <w:rPr>
@@ -5248,7 +5018,7 @@
         <w:t>[INSERT LIVE NUMBER]</w:t>
       </w:r>
       <w:r>
-        <w:t>. This is intentional. Yurich's own brand rules forbid inventing numbers for rhythm. Whoever publishes a post has to fill the real figure or drop the card.</w:t>
+        <w:t>. That is not boilerplate, I forbid myself from inventing numbers for rhythm. Before I publish, I have to fill in the real figure or drop the card entirely.</w:t>
       </w:r>
     </w:p>
     <w:p>
@@ -5260,12 +5030,7 @@
           <w:color w:val="6E6E6E"/>
           <w:sz w:val="16"/>
         </w:rPr>
-        <w:t>————————————————————</w:t>
-      </w:r>
-    </w:p>
-    <w:p>
-      <w:r>
-        <w:br w:type="page"/>
+        <w:t>..............................</w:t>
       </w:r>
     </w:p>
     <w:p>
@@ -5273,77 +5038,27 @@
         <w:pStyle w:val="Heading1"/>
       </w:pPr>
       <w:r>
-        <w:t>01. Who Yurich is</w:t>
-      </w:r>
-    </w:p>
-    <w:p>
-      <w:r>
-        <w:t xml:space="preserve">Yurich, also Pavel Vasilkovsky, based in Sevastopol. Public surfaces: the channel </w:t>
-      </w:r>
-      <w:r>
-        <w:rPr>
-          <w:rFonts w:ascii="Consolas" w:hAnsi="Consolas"/>
-          <w:color w:val="5B7A00"/>
-        </w:rPr>
-        <w:t>t.me/YuRichRWA</w:t>
-      </w:r>
-      <w:r>
-        <w:t xml:space="preserve">, personal contact </w:t>
-      </w:r>
-      <w:r>
-        <w:rPr>
-          <w:rFonts w:ascii="Consolas" w:hAnsi="Consolas"/>
-          <w:color w:val="5B7A00"/>
-        </w:rPr>
-        <w:t>t.me/PavelYuRichRWA</w:t>
-      </w:r>
-      <w:r>
-        <w:t xml:space="preserve">, X </w:t>
-      </w:r>
-      <w:r>
-        <w:rPr>
-          <w:rFonts w:ascii="Consolas" w:hAnsi="Consolas"/>
-          <w:color w:val="5B7A00"/>
-        </w:rPr>
-        <w:t>x.com/PavelYuRichRWA</w:t>
-      </w:r>
-      <w:r>
-        <w:t xml:space="preserve">. The project is anchored at </w:t>
-      </w:r>
-      <w:r>
-        <w:rPr>
-          <w:rFonts w:ascii="Consolas" w:hAnsi="Consolas"/>
-          <w:color w:val="5B7A00"/>
-        </w:rPr>
-        <w:t>44.6167 N, 33.5258 E</w:t>
-      </w:r>
-      <w:r>
-        <w:t xml:space="preserve">, on the Black Sea, marked </w:t>
-      </w:r>
-      <w:r>
-        <w:rPr>
-          <w:rFonts w:ascii="Consolas" w:hAnsi="Consolas"/>
-          <w:color w:val="5B7A00"/>
-        </w:rPr>
-        <w:t>EST. 2026</w:t>
-      </w:r>
-      <w:r>
-        <w:t>.</w:t>
-      </w:r>
-    </w:p>
-    <w:p>
-      <w:r>
-        <w:t>He is not a crypto commentator reacting to other people's charts, and not the standard Web3 founder with a forty slide deck about the next Ethereum. He is building what he calls an operating system for a city, layer by layer, starting from a free utility and ending in a regulated financial instrument. That detail matters for positioning. Most people loudly discussing RWA on LinkedIn either manage institutional capital (BlackRock, Franklin Templeton, Fidelity) or build infrastructure protocols (Securitize, Ondo, Centrifuge, Superstate). Almost nobody is talking about RWA at the scale of one real city and its everyday cash flow. That gap is exactly where Yurich is positioned.</w:t>
-      </w:r>
-    </w:p>
-    <w:p>
-      <w:r>
-        <w:t>His documented voice: dry, informal, no words like unique, dive in, don't miss out, revolution, alpha. A number beats an adjective. Zero only has meaning as a refusal: zero signals, zero money routed to my personal account. He is allowed to sound unsure inside an analysis, never about the role "I am not the operator, not the exchange," and never about someone else's money. That register is rare in the RWA niche, where most founders sell certainty. Yurich visibly sells sobriety. On a LinkedIn audience that grew tired of "unlock trillions" rhetoric by 2025 to 2026, sobriety reads as a contrarian position, and that is exactly why it carries viral potential.</w:t>
-      </w:r>
-    </w:p>
-    <w:p>
-      <w:r>
-        <w:t>What is already built, in order:</w:t>
+        <w:t>01. Who I am</w:t>
+      </w:r>
+    </w:p>
+    <w:p>
+      <w:r>
+        <w:t>My name is Yurich, also Pavel Vasilkovsky, based in Sevastopol.</w:t>
+      </w:r>
+    </w:p>
+    <w:p>
+      <w:r>
+        <w:t>I am not a crypto commentator reacting to other people's charts, and not the standard Web3 founder with a forty slide deck about the next Ethereum. I am building what I call an operating system for a city, layer by layer, starting from a free utility and ending in a regulated financial instrument. That matters for my positioning. Most people loudly discussing RWA on LinkedIn either manage institutional capital (BlackRock, Franklin Templeton, Fidelity) or build infrastructure protocols (Securitize, Ondo, Centrifuge, Superstate). Almost nobody talks about RWA at the scale of one real city and its everyday cash flow. That gap is exactly where I am aiming.</w:t>
+      </w:r>
+    </w:p>
+    <w:p>
+      <w:r>
+        <w:t>My voice: dry, informal, no words like unique, dive in, don't miss out, revolution, alpha. A number beats an adjective. Zero only has meaning for me as a refusal: zero signals, zero money routed to my personal account. I let myself sound unsure inside an analysis, never about my role, "I am not the operator, not the exchange," and never about someone else's money. That register is rare in the RWA niche, where most founders sell certainty. I visibly sell sobriety instead. On a LinkedIn audience that grew tired of "unlock trillions" rhetoric by 2025 to 2026, sobriety reads as a contrarian position, and that is exactly why it carries viral potential.</w:t>
+      </w:r>
+    </w:p>
+    <w:p>
+      <w:r>
+        <w:t>What I have already built, in order:</w:t>
       </w:r>
     </w:p>
     <w:p>
@@ -5357,7 +5072,7 @@
         <w:t>Sevastopol AI.</w:t>
       </w:r>
       <w:r>
-        <w:t xml:space="preserve"> A Telegram bot about the city. Over 200 food venues, over 100 locations, routes, events, photos and coordinates. People arrive with one practical question (where to eat, where to catch the sunset) and come back to add their own spots. This is the "Open" layer: free, no barrier to entry, built on utility rather than a promise of yield.</w:t>
+        <w:t xml:space="preserve"> My Telegram bot about the city. Over 200 food venues, over 100 locations, routes, events, photos and coordinates. People arrive with one practical question (where to eat, where to catch the sunset) and come back to add their own spots. This is my "Open" layer: free, no barrier to entry, built on utility rather than a promise of yield.</w:t>
       </w:r>
     </w:p>
     <w:p>
@@ -5371,7 +5086,7 @@
         <w:t>City Code.</w:t>
       </w:r>
       <w:r>
-        <w:t xml:space="preserve"> A closed circle around Sevastopol. Not a discount card, a system of six keys: Code (the rulebook, who gets in and how), Privileges (perks with partners), Partner Circle (the partners themselves), Events (closed gatherings), Insights (city data not publicly available), and Member Circle (the community). Financial infrastructure partners include Hermes Exchange and Nebank. This is the "Enter" layer: selection, status, belonging.</w:t>
+        <w:t xml:space="preserve"> My closed circle around Sevastopol. Not a discount card, a system of six keys: Code (the rulebook, who gets in and how), Privileges (perks with partners), Partner Circle (the partners themselves), Events (closed gatherings), Insights (city data not publicly available), and Member Circle (the community). Financial infrastructure partners include Hermes Exchange and Nebank. This is my "Enter" layer: selection, status, belonging.</w:t>
       </w:r>
     </w:p>
     <w:p>
@@ -5385,7 +5100,7 @@
         <w:t>Crimea RWA.</w:t>
       </w:r>
       <w:r>
-        <w:t xml:space="preserve"> A test of one hypothesis: can a share of a city's real cash register be packaged as a digital financial asset under Russia's 259-FZ law. The educational example on the site: a share of revenue from a City Code partner coffee shop, issuance size 10,000,000 rubles, 2,000 units at a 5,000 ruble par value, quarterly payouts from the venue's revenue, maturity on 31 December 2028, a licensed issuer entity, and a platform operator registered with the Bank of Russia. The status is labeled honestly: an educational mockup, not an offer, the next horizon. This is the "Own" layer.</w:t>
+        <w:t xml:space="preserve"> My test of one hypothesis: can a share of a city's real cash register be packaged as a digital financial asset under Russia's 259-FZ law. My educational example: a share of revenue from a City Code partner coffee shop, issuance size 10,000,000 rubles, 2,000 units at a 5,000 ruble par value, quarterly payouts from the venue's revenue, maturity on 31 December 2028, a licensed issuer entity, and a platform operator registered with the Bank of Russia. I label the status honestly: an educational mockup, not an offer, the next horizon. This is my "Own" layer.</w:t>
       </w:r>
     </w:p>
     <w:p>
@@ -5399,7 +5114,7 @@
         <w:t>The YuRich RWA course.</w:t>
       </w:r>
       <w:r>
-        <w:t xml:space="preserve"> Six modules: start, what RWA is, asset categories, infrastructure, regulation across the CIS, liquidity and risk, and a map of market players. No trading, no signals, a hard boundary by design: signals live in the channel, not in the educational product.</w:t>
+        <w:t xml:space="preserve"> Six modules: start, what RWA is, asset categories, infrastructure, regulation across the CIS, liquidity and risk, and a map of market players. No trading, no signals, a hard boundary I set on purpose: signals live in the channel, not in the educational product.</w:t>
       </w:r>
     </w:p>
     <w:p>
@@ -5427,12 +5142,12 @@
         <w:t>CFA structuring, B2B.</w:t>
       </w:r>
       <w:r>
-        <w:t xml:space="preserve"> A paid service for businesses: take a real asset (production, equipment, leases, contracted revenue) and carry it to a CFA issuance through a licensed operator. Yurich states it plainly: "I am not the operator, not the exchange." Investor money moves through the platform to the issuer, never to Yurich's account. Pricing is transparent: a free call, an assessment for 80,000 rubles, structuring for 250,000 to 400,000 rubles, onboarding to a platform for 200,000 to 350,000 rubles plus the operator's fee, a success fee of 3 to 7 percent only on money that actually lands with the issuer, and ongoing support at 40,000 rubles a month.</w:t>
-      </w:r>
-    </w:p>
-    <w:p>
-      <w:r>
-        <w:t>Three structural differences from typical RWA content on LinkedIn, and the three things positioning should be built on:</w:t>
+        <w:t xml:space="preserve"> My paid service for businesses: take a real asset (production, equipment, leases, contracted revenue) and carry it to a CFA issuance through a licensed operator. I tell clients plainly: "I am not the operator, not the exchange." Investor money moves through the platform to the issuer, never to my account. My pricing is transparent: a free call, an assessment for 80,000 rubles, structuring for 250,000 to 400,000 rubles, onboarding to a platform for 200,000 to 350,000 rubles plus the operator's fee, a success fee of 3 to 7 percent only on money that actually lands with the issuer, and ongoing support at 40,000 rubles a month.</w:t>
+      </w:r>
+    </w:p>
+    <w:p>
+      <w:r>
+        <w:t>Three structural differences I build my positioning on:</w:t>
       </w:r>
     </w:p>
     <w:p>
@@ -5443,25 +5158,25 @@
         <w:rPr>
           <w:b/>
         </w:rPr>
-        <w:t>This is not a token factory.</w:t>
-      </w:r>
-      <w:r>
-        <w:t xml:space="preserve"> Yurich explicitly refuses to be the operator or the exchange. He structures the deal and steps out of the way, the opposite of "we mint the token and hold the keys." 2. </w:t>
+        <w:t>I am not a token factory.</w:t>
+      </w:r>
+      <w:r>
+        <w:t xml:space="preserve"> I explicitly refuse to be the operator or the exchange. I structure the deal and step out of the way, the opposite of "I mint the token and hold the keys." 2. </w:t>
       </w:r>
       <w:r>
         <w:rPr>
           <w:b/>
         </w:rPr>
-        <w:t>It runs bottom up, not top down.</w:t>
-      </w:r>
-      <w:r>
-        <w:t xml:space="preserve"> Institutional RWA moves from trillions (treasuries, private credit) toward the retail investor. Yurich moves from one city, one coffee shop, one community toward a model that can later be repeated anywhere. 3. </w:t>
+        <w:t>I run bottom up, not top down.</w:t>
+      </w:r>
+      <w:r>
+        <w:t xml:space="preserve"> Institutional RWA moves from trillions (treasuries, private credit) toward the retail investor. I move from one city, one coffee shop, one community toward a model that can later be repeated anywhere. 3. </w:t>
       </w:r>
       <w:r>
         <w:rPr>
           <w:b/>
         </w:rPr>
-        <w:t>It is a chain of trust, not a chain of hype.</w:t>
+        <w:t>I build a chain of trust, not a chain of hype.</w:t>
       </w:r>
       <w:r>
         <w:t xml:space="preserve"> A free utility (the bot) builds trust and traffic, trust converts into community (City Code), community converts into capital (Crimea RWA). That is closer to Y Combinator's "do things that don't scale" than to 2021 era ICO logic.</w:t>
@@ -5476,12 +5191,7 @@
           <w:color w:val="6E6E6E"/>
           <w:sz w:val="16"/>
         </w:rPr>
-        <w:t>————————————————————</w:t>
-      </w:r>
-    </w:p>
-    <w:p>
-      <w:r>
-        <w:br w:type="page"/>
+        <w:t>..............................</w:t>
       </w:r>
     </w:p>
     <w:p>
@@ -5489,12 +5199,12 @@
         <w:pStyle w:val="Heading1"/>
       </w:pPr>
       <w:r>
-        <w:t>02. City Code architecture, how to read the stack</w:t>
-      </w:r>
-    </w:p>
-    <w:p>
-      <w:r>
-        <w:t xml:space="preserve">The load bearing formula from the YurichHub site: </w:t>
+        <w:t>02. City Code architecture, how I assemble the stack</w:t>
+      </w:r>
+    </w:p>
+    <w:p>
+      <w:r>
+        <w:t xml:space="preserve">My load bearing formula, the one the whole narrative stands on: </w:t>
       </w:r>
       <w:r>
         <w:rPr>
@@ -5503,17 +5213,17 @@
         <w:t>"Open. Enter. Own."</w:t>
       </w:r>
       <w:r>
-        <w:t xml:space="preserve"> Three words, three products, three funnel stages. It is a rare case of a Web3 project having a coherent, non technical metaphor that can be explained to someone who has never heard of a blockchain. That is a real asset on LinkedIn, where most of the audience is finance people, lawyers, VCs, and operators of traditional businesses, not crypto natives.</w:t>
-      </w:r>
-    </w:p>
-    <w:p>
-      <w:r>
-        <w:t>Layer one, Sevastopol AI, answers "where." Layer two, City Code, answers "with whom." Layer three, Crimea RWA, answers "what do I actually own now." There is no gap between the layers: the bot is free and open, the circle is closed but reachable by application or contribution to the city, ownership is still marked as a horizon, not a product on sale today.</w:t>
-      </w:r>
-    </w:p>
-    <w:p>
-      <w:r>
-        <w:t>This is a structural difference from the typical tokenization story, where the token is sold first and community and utility are promised later. Here the order is reversed: utility and community first, and once there is real revenue and real partners, a financial instrument is built on top of it. That is the substantive answer to "what does RWA have to do with any of this": here RWA is not the starting point of the hype cycle, it is the final, most demanding rung of trust.</w:t>
+        <w:t xml:space="preserve"> Three words, three products, three funnel stages. It is a rare case of a Web3 project having a coherent, non technical metaphor I can explain to someone who has never heard of a blockchain. That is a real asset on LinkedIn, where most of the audience is finance people, lawyers, VCs, and operators of traditional businesses, not crypto natives.</w:t>
+      </w:r>
+    </w:p>
+    <w:p>
+      <w:r>
+        <w:t>Layer one, Sevastopol AI, answers "where." Layer two, City Code, answers "with whom." Layer three, Crimea RWA, answers "what do I actually own now." There is no gap between my layers: the bot is free and open, the circle is closed but reachable by application or contribution to the city, ownership is still marked as a horizon, not a product on sale today.</w:t>
+      </w:r>
+    </w:p>
+    <w:p>
+      <w:r>
+        <w:t>This is a structural difference from the typical tokenization story, where the token is sold first and community and utility are promised later. For me the order is reversed: utility and community first, and once there is real revenue and real partners, I build a financial instrument on top of it. That is my substantive answer to "what does RWA have to do with any of this": for me RWA is not the starting point of the hype cycle, it is the final, most demanding rung of trust.</w:t>
       </w:r>
     </w:p>
     <w:p>
@@ -5525,12 +5235,7 @@
           <w:color w:val="6E6E6E"/>
           <w:sz w:val="16"/>
         </w:rPr>
-        <w:t>————————————————————</w:t>
-      </w:r>
-    </w:p>
-    <w:p>
-      <w:r>
-        <w:br w:type="page"/>
+        <w:t>..............................</w:t>
       </w:r>
     </w:p>
     <w:p>
@@ -5553,17 +5258,17 @@
     </w:p>
     <w:p>
       <w:r>
-        <w:t>That gap is exactly where Yurich is aiming. Institutional RWA answers "how do we wrap a trillion dollars of treasuries for a fund." Yurich's project answers a different question: "how do we legally wrap the revenue of one real venue in one real city so that a neighbor down the street can actually buy in." These are two different markets that only overlap on the word "tokenization." They solve opposite problems: institutional RWA is chasing scale and liquidity, city level RWA is chasing trust and repeatability.</w:t>
-      </w:r>
-    </w:p>
-    <w:p>
-      <w:r>
-        <w:t>In Russia, the legal framework for retail tokenization is not "blockchain and a smart contract," it is the 259-FZ law and digital financial assets (CFA): a record of rights kept by an information system operator registered with the Bank of Russia. A CFA in this model almost always certifies not a share in a business but a monetary claim, a right to receive a scheduled payout. The investor does not buy the business, they buy the right to be paid by the issuer. That is a structurally different construction from "a token on Ethereum," and it is exactly why Yurich repeats "I am not the operator," "I am not the exchange," "money does not land on my account" so insistently: in this jurisdiction, that distinction is what separates a legal deal from an illegal one.</w:t>
-      </w:r>
-    </w:p>
-    <w:p>
-      <w:r>
-        <w:t>For an international LinkedIn audience this is the most counterintuitive fact worth leading with: while the rest of the world debates on chain equity and direct ownership through a blockchain (Securitize, Superstate, Figure), retail tokenization of a real asset has already been a regulated product inside the Russian legal system since 2020, it simply carries a different name and a different shape. That gives Yurich a rare position: he can talk about RWA not as an evangelist of an unregulated future, but as a practitioner already operating inside a regulated frame, and translate it for people looking at it from the outside.</w:t>
+        <w:t>That gap is exactly where I am aiming. Institutional RWA answers "how do we wrap a trillion dollars of treasuries for a fund." I answer a different question: "how do I legally wrap the revenue of one real venue in one real city so that a neighbor down the street can actually buy in." These are two different markets that only overlap on the word "tokenization." They solve opposite problems: institutional RWA is chasing scale and liquidity, my city level RWA is chasing trust and repeatability.</w:t>
+      </w:r>
+    </w:p>
+    <w:p>
+      <w:r>
+        <w:t>In Russia, the legal framework for retail tokenization is not "blockchain and a smart contract," it is the 259-FZ law and digital financial assets (CFA): a record of rights kept by an information system operator registered with the Bank of Russia. In my model, a CFA almost always certifies not a share in a business but a monetary claim, a right to receive a scheduled payout. The investor does not buy the business, they buy the right to be paid by the issuer. That is a structurally different construction from "a token on Ethereum," and it is exactly why I repeat "I am not the operator," "I am not the exchange," "money does not land on my account" so insistently: in this jurisdiction, that distinction is what separates a legal deal from an illegal one.</w:t>
+      </w:r>
+    </w:p>
+    <w:p>
+      <w:r>
+        <w:t>For an international LinkedIn audience this is the most counterintuitive fact I can lead with: while the rest of the world debates on chain equity and direct ownership through a blockchain (Securitize, Superstate, Figure), retail tokenization of a real asset has already been a regulated product inside the Russian legal system since 2020, it simply carries a different name and a different shape. That gives me a rare position: I can talk about RWA not as an evangelist of an unregulated future, but as a practitioner already operating inside a regulated frame, translating it for people looking at it from the outside.</w:t>
       </w:r>
     </w:p>
     <w:p>
@@ -5575,12 +5280,7 @@
           <w:color w:val="6E6E6E"/>
           <w:sz w:val="16"/>
         </w:rPr>
-        <w:t>————————————————————</w:t>
-      </w:r>
-    </w:p>
-    <w:p>
-      <w:r>
-        <w:br w:type="page"/>
+        <w:t>..............................</w:t>
       </w:r>
     </w:p>
     <w:p>
@@ -5588,12 +5288,12 @@
         <w:pStyle w:val="Heading1"/>
       </w:pPr>
       <w:r>
-        <w:t>04. Mapping the global RWA field, where Yurich sits</w:t>
-      </w:r>
-    </w:p>
-    <w:p>
-      <w:r>
-        <w:t>For the positioning to hold up internationally, Yurich needs to be placed on a map, not presented in a vacuum. Below, a comparison across three axes: what is being tokenized, which direction capital moves, and the founder's role.</w:t>
+        <w:t>04. Mapping the global RWA field, where I stand</w:t>
+      </w:r>
+    </w:p>
+    <w:p>
+      <w:r>
+        <w:t>For my positioning to hold up internationally, I need to place myself on a map, not present myself in a vacuum. Below, a comparison across three axes: what is being tokenized, which direction capital moves, and the founder's role.</w:t>
       </w:r>
     </w:p>
     <w:tbl>
@@ -5922,7 +5622,7 @@
               <w:rPr>
                 <w:sz w:val="17"/>
               </w:rPr>
-              <w:t>Yurich, Crimea RWA</w:t>
+              <w:t>Me, Crimea RWA</w:t>
             </w:r>
           </w:p>
         </w:tc>
@@ -5964,7 +5664,7 @@
               <w:rPr>
                 <w:sz w:val="17"/>
               </w:rPr>
-              <w:t>One person, a public face, the funnel is built around trust in the founder</w:t>
+              <w:t>One person, me, a public face, my funnel is built around trust in me</w:t>
             </w:r>
           </w:p>
         </w:tc>
@@ -5973,7 +5673,7 @@
     <w:p/>
     <w:p>
       <w:r>
-        <w:t>The takeaway for positioning: no major player today is building RWA bottom up, from one city and its daily economy, and none of the major players makes the founder the central public face of an "aware, enter, own" funnel. Yurich can own the niche of "one city's RWA as a repeatable playbook" and speak as a practitioner, not a theorist: he already has a bot with real users, a circle with real partners, and a paid service for businesses with real pricing. That is stronger than "I have an idea," and weaker than an institution with billions under management, which is why the voice has to be building in public: honest numbers, honest refusals, honest pace.</w:t>
+        <w:t>The takeaway for my positioning: no major player today is building RWA bottom up, from one city and its daily economy, and none of the major players makes the founder the central public face of an "aware, enter, own" funnel. I can own the niche of "one city's RWA as a repeatable playbook" and speak as a practitioner, not a theorist: I already have a bot with real users, a circle with real partners, and a paid service for businesses with real pricing. That is stronger than "I have an idea," and weaker than an institution with billions under management, which is why my voice has to be building in public: honest numbers, honest refusals, honest pace.</w:t>
       </w:r>
     </w:p>
     <w:p>
@@ -5985,12 +5685,7 @@
           <w:color w:val="6E6E6E"/>
           <w:sz w:val="16"/>
         </w:rPr>
-        <w:t>————————————————————</w:t>
-      </w:r>
-    </w:p>
-    <w:p>
-      <w:r>
-        <w:br w:type="page"/>
+        <w:t>..............................</w:t>
       </w:r>
     </w:p>
     <w:p>
@@ -5998,7 +5693,7 @@
         <w:pStyle w:val="Heading1"/>
       </w:pPr>
       <w:r>
-        <w:t>05. SWOT: Yurich as a public RWA persona</w:t>
+        <w:t>05. My SWOT as a public RWA persona</w:t>
       </w:r>
     </w:p>
     <w:tbl>
@@ -6073,7 +5768,7 @@
               <w:rPr>
                 <w:sz w:val="17"/>
               </w:rPr>
-              <w:t>Scale is not comparable to institutional players yet, and that should be admitted, not hidden</w:t>
+              <w:t>My scale is not comparable to institutional players yet, and I should admit that, not hide it</w:t>
             </w:r>
           </w:p>
         </w:tc>
@@ -6089,7 +5784,7 @@
               <w:rPr>
                 <w:sz w:val="17"/>
               </w:rPr>
-              <w:t>A clear legal and ethical boundary: not the operator, not the exchange, money never lands on his account</w:t>
+              <w:t>A clear legal and ethical boundary: not the operator, not the exchange, money never lands on my account</w:t>
             </w:r>
           </w:p>
         </w:tc>
@@ -6103,7 +5798,7 @@
               <w:rPr>
                 <w:sz w:val="17"/>
               </w:rPr>
-              <w:t>Sevastopol and Crimea carry geopolitical sensitivity for part of the international audience, which can close off foreign investors and several platforms</w:t>
+              <w:t>Sevastopol and Crimea carry geopolitical sensitivity for part of the international audience, which can close off foreign investors and several platforms for me</w:t>
             </w:r>
           </w:p>
         </w:tc>
@@ -6133,7 +5828,7 @@
               <w:rPr>
                 <w:sz w:val="17"/>
               </w:rPr>
-              <w:t>Most content exists in Russian today, translating the voice into English requires discipline</w:t>
+              <w:t>Most of my content exists in Russian today, translating my voice into English requires discipline</w:t>
             </w:r>
           </w:p>
         </w:tc>
@@ -6163,7 +5858,7 @@
               <w:rPr>
                 <w:sz w:val="17"/>
               </w:rPr>
-              <w:t>One person carrying the whole operational and public load, a real risk of burnout and irregular posting</w:t>
+              <w:t>I am one person carrying the whole operational and public load, a real risk of burnout and irregular posting</w:t>
             </w:r>
           </w:p>
         </w:tc>
@@ -6193,7 +5888,7 @@
               <w:rPr>
                 <w:sz w:val="17"/>
               </w:rPr>
-              <w:t>No completed, non educational CFA issuance yet, which limits the proof base</w:t>
+              <w:t>I have no completed, non educational CFA issuance yet, which limits my proof base</w:t>
             </w:r>
           </w:p>
         </w:tc>
@@ -6258,7 +5953,7 @@
               <w:rPr>
                 <w:sz w:val="17"/>
               </w:rPr>
-              <w:t>Global fatigue with the institutional RWA narrative creates demand for a human alternative story</w:t>
+              <w:t>Global fatigue with the institutional RWA narrative creates demand for my human alternative story</w:t>
             </w:r>
           </w:p>
         </w:tc>
@@ -6272,7 +5967,7 @@
               <w:rPr>
                 <w:sz w:val="17"/>
               </w:rPr>
-              <w:t>The 259-FZ regulatory environment and adjacent law can change faster than a content calendar</w:t>
+              <w:t>The 259-FZ regulatory environment and adjacent law can change faster than my content calendar</w:t>
             </w:r>
           </w:p>
         </w:tc>
@@ -6302,7 +5997,7 @@
               <w:rPr>
                 <w:sz w:val="17"/>
               </w:rPr>
-              <w:t>Risk that an international audience confuses educational tone with an investment offer, with legal consequences</w:t>
+              <w:t>Risk that an international audience confuses my educational tone with an investment offer, with legal consequences for me</w:t>
             </w:r>
           </w:p>
         </w:tc>
@@ -6332,7 +6027,7 @@
               <w:rPr>
                 <w:sz w:val="17"/>
               </w:rPr>
-              <w:t>Other cities or creators copying the model faster than Yurich can claim authorship of the idea</w:t>
+              <w:t>Other cities or creators copying my model faster than I can claim authorship of the idea</w:t>
             </w:r>
           </w:p>
         </w:tc>
@@ -6348,7 +6043,7 @@
               <w:rPr>
                 <w:sz w:val="17"/>
               </w:rPr>
-              <w:t>Partnerships with Hermes Exchange and Nebank create natural co-content and cross audience</w:t>
+              <w:t>Partnerships with Hermes Exchange and Nebank give me natural co-content and cross audience</w:t>
             </w:r>
           </w:p>
         </w:tc>
@@ -6362,7 +6057,7 @@
               <w:rPr>
                 <w:sz w:val="17"/>
               </w:rPr>
-              <w:t>Skepticism from crypto natives toward "yet another RWA project" if words are not backed by deeds and numbers</w:t>
+              <w:t>Skepticism from crypto natives toward "yet another RWA project" if I do not back words with deeds and numbers</w:t>
             </w:r>
           </w:p>
         </w:tc>
@@ -6378,12 +6073,7 @@
           <w:color w:val="6E6E6E"/>
           <w:sz w:val="16"/>
         </w:rPr>
-        <w:t>————————————————————</w:t>
-      </w:r>
-    </w:p>
-    <w:p>
-      <w:r>
-        <w:br w:type="page"/>
+        <w:t>..............................</w:t>
       </w:r>
     </w:p>
     <w:p>
@@ -6391,7 +6081,7 @@
         <w:pStyle w:val="Heading1"/>
       </w:pPr>
       <w:r>
-        <w:t>06. LinkedIn audience: six segments</w:t>
+        <w:t>06. My LinkedIn audience: six segments</w:t>
       </w:r>
     </w:p>
     <w:p>
@@ -6405,7 +6095,7 @@
         <w:t>RWA infrastructure builders.</w:t>
       </w:r>
       <w:r>
-        <w:t xml:space="preserve"> Teams at Securitize, Ondo, Centrifuge, Superstate, Plume and similar protocols. For them, Yurich is interesting as a practitioner of a niche case, a potential integration partner, or simply a fresh angle on retail tokenization outside the US. 2. </w:t>
+        <w:t xml:space="preserve"> Teams at Securitize, Ondo, Centrifuge, Superstate, Plume and similar protocols. For them, I am interesting as a practitioner of a niche case, a potential integration partner, or simply a fresh angle on retail tokenization outside the US. 2. </w:t>
       </w:r>
       <w:r>
         <w:rPr>
@@ -6414,7 +6104,7 @@
         <w:t>Institutional allocators and family offices.</w:t>
       </w:r>
       <w:r>
-        <w:t xml:space="preserve"> People already allocating into treasury tokens and scouting alternative RWA categories. Their bar is high, and they care about structural rigor, not hype, which is exactly where the line "I am not the operator, not the exchange" lands. 3. </w:t>
+        <w:t xml:space="preserve"> People already allocating into treasury tokens and scouting alternative RWA categories. Their bar is high, and they care about structural rigor, not hype, which is exactly where my line "I am not the operator, not the exchange" lands. 3. </w:t>
       </w:r>
       <w:r>
         <w:rPr>
@@ -6423,7 +6113,7 @@
         <w:t>Venture investors and angels in financial infrastructure.</w:t>
       </w:r>
       <w:r>
-        <w:t xml:space="preserve"> Looking for founder-market fit and a defensible thesis. The key signal for them: Yurich already monetizes (paid CFA structuring) before raising venture money, a rare and strong discipline signal. 4. </w:t>
+        <w:t xml:space="preserve"> Looking for founder-market fit and a defensible thesis. The key signal for them: I already monetize (paid CFA structuring) before raising venture money, a rare and strong discipline signal. 4. </w:t>
       </w:r>
       <w:r>
         <w:rPr>
@@ -6432,7 +6122,7 @@
         <w:t>Lawyers, compliance and digital asset regulatory experts.</w:t>
       </w:r>
       <w:r>
-        <w:t xml:space="preserve"> The most skeptical and most valuable audience for building trust: a precise, unembellished post about 259-FZ mechanics is what converts this group into commenters and amplifiers. 5. </w:t>
+        <w:t xml:space="preserve"> The most skeptical and most valuable audience for building my trust: a precise, unembellished post about 259-FZ mechanics is what converts this group into commenters and amplifiers. 5. </w:t>
       </w:r>
       <w:r>
         <w:rPr>
@@ -6441,7 +6131,7 @@
         <w:t>Urban tech, smart city and local economy specialists.</w:t>
       </w:r>
       <w:r>
-        <w:t xml:space="preserve"> A less obvious, less crowded segment. This audience has not seen RWA applied to urban economics yet, and reacts with curiosity rather than veteran crypto cycle skepticism. 6. </w:t>
+        <w:t xml:space="preserve"> A less obvious, less crowded segment for me. This audience has not seen RWA applied to urban economics yet, and reacts with curiosity rather than veteran crypto cycle skepticism. 6. </w:t>
       </w:r>
       <w:r>
         <w:rPr>
@@ -6450,12 +6140,12 @@
         <w:t>Web3 founders and builders migrating from Crypto Twitter to LinkedIn.</w:t>
       </w:r>
       <w:r>
-        <w:t xml:space="preserve"> A visible migration of mature crypto audiences to LinkedIn in 2025 to 2026, looking for a more professional register. This is a natural home audience for building in public stories.</w:t>
-      </w:r>
-    </w:p>
-    <w:p>
-      <w:r>
-        <w:t xml:space="preserve">A separate methodological note: given the sanctions context around Crimea and Sevastopol, English language content should be built as </w:t>
+        <w:t xml:space="preserve"> A visible migration of mature crypto audiences to LinkedIn in 2025 to 2026, looking for a more professional register. This is my natural home audience for building in public stories.</w:t>
+      </w:r>
+    </w:p>
+    <w:p>
+      <w:r>
+        <w:t xml:space="preserve">A note I keep in mind: given the sanctions context around Crimea and Sevastopol, my English language content should be built as </w:t>
       </w:r>
       <w:r>
         <w:rPr>
@@ -6464,7 +6154,7 @@
         <w:t>thought leadership and a demonstration of the playbook</w:t>
       </w:r>
       <w:r>
-        <w:t>, not as an invitation for international investors to participate in specific CFA issuances. This is not just the legally cleaner choice, it is also strategically stronger: the goal of the English posts is to secure Yurich's authorship of the idea "a city as an RWA asset" on the international stage, not to sell shares to unqualified foreign investors who cannot physically access them. Revenue continues to come from the CFA structuring service for businesses (mostly Russian speaking, regional clients) and from reputational capital that later converts into partnerships, speaking invitations, consulting, and possibly exporting the model to other jurisdictions.</w:t>
+        <w:t>, not as an invitation for international investors to participate in specific CFA issuances. This is not just the legally cleaner choice for me, it is also strategically stronger: the goal of my English posts is to secure my authorship of the idea "a city as an RWA asset" on the international stage, not to sell shares to unqualified foreign investors who cannot physically access them. I keep earning revenue from the CFA structuring service for businesses (mostly Russian speaking, regional clients) and from reputational capital that I later convert into partnerships, speaking invitations, consulting, and possibly exporting the model to other jurisdictions.</w:t>
       </w:r>
     </w:p>
     <w:p>
@@ -6476,12 +6166,7 @@
           <w:color w:val="6E6E6E"/>
           <w:sz w:val="16"/>
         </w:rPr>
-        <w:t>————————————————————</w:t>
-      </w:r>
-    </w:p>
-    <w:p>
-      <w:r>
-        <w:br w:type="page"/>
+        <w:t>..............................</w:t>
       </w:r>
     </w:p>
     <w:p>
@@ -6578,7 +6263,7 @@
         <w:t>Links hurt reach.</w:t>
       </w:r>
       <w:r>
-        <w:t xml:space="preserve"> LinkedIn suppresses posts carrying an outbound link in the body. The standard workaround: move the link into the first comment right after publishing.</w:t>
+        <w:t xml:space="preserve"> LinkedIn suppresses posts carrying an outbound link in the body. My standard workaround: I move the link into the first comment right after publishing.</w:t>
       </w:r>
     </w:p>
     <w:p>
@@ -6592,7 +6277,7 @@
         <w:t>Document carousels (PDF slides) and native personal video now outperform a single image.</w:t>
       </w:r>
       <w:r>
-        <w:t xml:space="preserve"> For a niche educational topic like RWA this matters a lot: a carousel lets you explain mechanics without losing attention by line five of a wall of text.</w:t>
+        <w:t xml:space="preserve"> For a niche educational topic like RWA this matters a lot: a carousel lets me explain mechanics without losing attention by line five of a wall of text.</w:t>
       </w:r>
     </w:p>
     <w:p>
@@ -6620,7 +6305,7 @@
         <w:t>The first hour of comments matters a great deal.</w:t>
       </w:r>
       <w:r>
-        <w:t xml:space="preserve"> The algorithm amplifies posts that get a quick response. Authors should budget 30 to 60 minutes after publishing to reply personally in comments.</w:t>
+        <w:t xml:space="preserve"> The algorithm amplifies posts that get a quick response. I budget 30 to 60 minutes after publishing to reply personally in comments.</w:t>
       </w:r>
     </w:p>
     <w:p>
@@ -6639,7 +6324,7 @@
     </w:p>
     <w:p>
       <w:r>
-        <w:t>These rules are fully compatible with Yurich's existing voice: he already writes dry, numbers first, no enthusiastic adjectives, with explicit refusals and boundaries. The job of the content plan is not to invent a new voice for LinkedIn, it is to cut the existing voice into the shapes the platform rewards.</w:t>
+        <w:t>These rules are fully compatible with my existing voice: I already write dry, numbers first, no enthusiastic adjectives, with explicit refusals and boundaries. My job is not to invent a new voice for LinkedIn, it is to cut my existing voice into the shapes the platform rewards.</w:t>
       </w:r>
     </w:p>
     <w:p>
@@ -6651,12 +6336,7 @@
           <w:color w:val="6E6E6E"/>
           <w:sz w:val="16"/>
         </w:rPr>
-        <w:t>————————————————————</w:t>
-      </w:r>
-    </w:p>
-    <w:p>
-      <w:r>
-        <w:br w:type="page"/>
+        <w:t>..............................</w:t>
       </w:r>
     </w:p>
     <w:p>
@@ -6664,7 +6344,7 @@
         <w:pStyle w:val="Heading1"/>
       </w:pPr>
       <w:r>
-        <w:t>08. Content pillars</w:t>
+        <w:t>08. My content pillars</w:t>
       </w:r>
     </w:p>
     <w:tbl>
@@ -6743,7 +6423,7 @@
               <w:rPr>
                 <w:sz w:val="17"/>
               </w:rPr>
-              <w:t>P1. Who Yurich is</w:t>
+              <w:t>P1. Who I am</w:t>
             </w:r>
           </w:p>
         </w:tc>
@@ -6845,7 +6525,7 @@
               <w:rPr>
                 <w:sz w:val="17"/>
               </w:rPr>
-              <w:t>How the bot, circle, ownership stack works and why it is systemic</w:t>
+              <w:t>How my bot, circle, ownership stack works and why it is systemic</w:t>
             </w:r>
           </w:p>
         </w:tc>
@@ -6933,7 +6613,7 @@
               <w:rPr>
                 <w:sz w:val="17"/>
               </w:rPr>
-              <w:t>Real numbers, real refusals, the process as it happens</w:t>
+              <w:t>Real numbers, real refusals, my process as it happens</w:t>
             </w:r>
           </w:p>
         </w:tc>
@@ -7007,12 +6687,7 @@
           <w:color w:val="6E6E6E"/>
           <w:sz w:val="16"/>
         </w:rPr>
-        <w:t>————————————————————</w:t>
-      </w:r>
-    </w:p>
-    <w:p>
-      <w:r>
-        <w:br w:type="page"/>
+        <w:t>..............................</w:t>
       </w:r>
     </w:p>
     <w:p>
@@ -7020,12 +6695,12 @@
         <w:pStyle w:val="Heading1"/>
       </w:pPr>
       <w:r>
-        <w:t>09. A 16 post, 5 week content plan</w:t>
-      </w:r>
-    </w:p>
-    <w:p>
-      <w:r>
-        <w:t xml:space="preserve">Cadence: 3 to 4 posts a week, Monday, Wednesday, Friday, plus one bonus post in weeks carrying two pillars. Format rotates: text, document carousel, a number card (use the existing cover generator </w:t>
+        <w:t>09. My 16 post, 5 week content plan</w:t>
+      </w:r>
+    </w:p>
+    <w:p>
+      <w:r>
+        <w:t xml:space="preserve">Cadence: 3 to 4 posts a week, Monday, Wednesday, Friday, plus one bonus post in weeks carrying two pillars. Format rotates: text, document carousel, a number card (using my existing cover generator </w:t>
       </w:r>
       <w:r>
         <w:rPr>
@@ -8779,7 +8454,7 @@
     <w:p/>
     <w:p>
       <w:r>
-        <w:t xml:space="preserve">CTA guidance: move links to the bot, course, or CFA offer into the first comment, use the post body for a conversation prompt ("which city do you think would replicate this first," "what would you ask a CFA operator," "agree or am I wrong"). Use hashtags sparingly: </w:t>
+        <w:t xml:space="preserve">My CTA guidance for myself: move links to the bot, course, or CFA offer into the first comment, use the post body for a conversation prompt ("which city do you think would replicate this first," "what would you ask a CFA operator," "agree or am I wrong"). I use hashtags sparingly: </w:t>
       </w:r>
       <w:r>
         <w:rPr>
@@ -8821,12 +8496,7 @@
           <w:color w:val="6E6E6E"/>
           <w:sz w:val="16"/>
         </w:rPr>
-        <w:t>————————————————————</w:t>
-      </w:r>
-    </w:p>
-    <w:p>
-      <w:r>
-        <w:br w:type="page"/>
+        <w:t>..............................</w:t>
       </w:r>
     </w:p>
     <w:p>
@@ -8852,7 +8522,7 @@
           <w:color w:val="6E6E6E"/>
           <w:sz w:val="18"/>
         </w:rPr>
-        <w:t>P1 - Who Yurich is · Format: Text · Hook: Story</w:t>
+        <w:t>P1 - Who I am · Format: Text · Hook: Story</w:t>
       </w:r>
     </w:p>
     <w:p>
@@ -8911,7 +8581,7 @@
           <w:color w:val="6E6E6E"/>
           <w:sz w:val="16"/>
         </w:rPr>
-        <w:t>————————————————————</w:t>
+        <w:t>..............................</w:t>
       </w:r>
     </w:p>
     <w:p>
@@ -8988,7 +8658,7 @@
           <w:color w:val="6E6E6E"/>
           <w:sz w:val="16"/>
         </w:rPr>
-        <w:t>————————————————————</w:t>
+        <w:t>..............................</w:t>
       </w:r>
     </w:p>
     <w:p>
@@ -9075,7 +8745,7 @@
           <w:color w:val="6E6E6E"/>
           <w:sz w:val="16"/>
         </w:rPr>
-        <w:t>————————————————————</w:t>
+        <w:t>..............................</w:t>
       </w:r>
     </w:p>
     <w:p>
@@ -9093,7 +8763,7 @@
           <w:color w:val="6E6E6E"/>
           <w:sz w:val="18"/>
         </w:rPr>
-        <w:t>P1 - Who Yurich is · Format: Text · Hook: Story</w:t>
+        <w:t>P1 - Who I am · Format: Text · Hook: Story</w:t>
       </w:r>
     </w:p>
     <w:p>
@@ -9157,7 +8827,7 @@
           <w:color w:val="6E6E6E"/>
           <w:sz w:val="16"/>
         </w:rPr>
-        <w:t>————————————————————</w:t>
+        <w:t>..............................</w:t>
       </w:r>
     </w:p>
     <w:p>
@@ -9244,7 +8914,7 @@
           <w:color w:val="6E6E6E"/>
           <w:sz w:val="16"/>
         </w:rPr>
-        <w:t>————————————————————</w:t>
+        <w:t>..............................</w:t>
       </w:r>
     </w:p>
     <w:p>
@@ -9326,7 +8996,7 @@
           <w:color w:val="6E6E6E"/>
           <w:sz w:val="16"/>
         </w:rPr>
-        <w:t>————————————————————</w:t>
+        <w:t>..............................</w:t>
       </w:r>
     </w:p>
     <w:p>
@@ -9369,7 +9039,7 @@
     </w:p>
     <w:p>
       <w:r>
-        <w:t>I am building from the opposite direction. Not "how do we wrap a trillion dollars for institutions," but "how do we legally wrap one venue's income so a neighbor down the street can buy in, not only a qualified investor on another continent."</w:t>
+        <w:t>I am building from the opposite direction. Not "how do we wrap a trillion dollars for institutions," but "how do I legally wrap one venue's income so a neighbor down the street can buy in, not only a qualified investor on another continent."</w:t>
       </w:r>
     </w:p>
     <w:p>
@@ -9403,7 +9073,7 @@
           <w:color w:val="6E6E6E"/>
           <w:sz w:val="16"/>
         </w:rPr>
-        <w:t>————————————————————</w:t>
+        <w:t>..............................</w:t>
       </w:r>
     </w:p>
     <w:p>
@@ -9480,7 +9150,7 @@
           <w:color w:val="6E6E6E"/>
           <w:sz w:val="16"/>
         </w:rPr>
-        <w:t>————————————————————</w:t>
+        <w:t>..............................</w:t>
       </w:r>
     </w:p>
     <w:p>
@@ -9552,7 +9222,7 @@
           <w:color w:val="6E6E6E"/>
           <w:sz w:val="16"/>
         </w:rPr>
-        <w:t>————————————————————</w:t>
+        <w:t>..............................</w:t>
       </w:r>
     </w:p>
     <w:p>
@@ -9629,7 +9299,7 @@
           <w:color w:val="6E6E6E"/>
           <w:sz w:val="16"/>
         </w:rPr>
-        <w:t>————————————————————</w:t>
+        <w:t>..............................</w:t>
       </w:r>
     </w:p>
     <w:p>
@@ -9706,7 +9376,7 @@
           <w:color w:val="6E6E6E"/>
           <w:sz w:val="16"/>
         </w:rPr>
-        <w:t>————————————————————</w:t>
+        <w:t>..............................</w:t>
       </w:r>
     </w:p>
     <w:p>
@@ -9783,7 +9453,7 @@
           <w:color w:val="6E6E6E"/>
           <w:sz w:val="16"/>
         </w:rPr>
-        <w:t>————————————————————</w:t>
+        <w:t>..............................</w:t>
       </w:r>
     </w:p>
     <w:p>
@@ -9801,7 +9471,7 @@
           <w:color w:val="6E6E6E"/>
           <w:sz w:val="18"/>
         </w:rPr>
-        <w:t>P1 - Who Yurich is · Format: Text · Hook: Counterintuitive</w:t>
+        <w:t>P1 - Who I am · Format: Text · Hook: Counterintuitive</w:t>
       </w:r>
     </w:p>
     <w:p>
@@ -9860,7 +9530,7 @@
           <w:color w:val="6E6E6E"/>
           <w:sz w:val="16"/>
         </w:rPr>
-        <w:t>————————————————————</w:t>
+        <w:t>..............................</w:t>
       </w:r>
     </w:p>
     <w:p>
@@ -9937,7 +9607,7 @@
           <w:color w:val="6E6E6E"/>
           <w:sz w:val="16"/>
         </w:rPr>
-        <w:t>————————————————————</w:t>
+        <w:t>..............................</w:t>
       </w:r>
     </w:p>
     <w:p>
@@ -10014,7 +9684,7 @@
           <w:color w:val="6E6E6E"/>
           <w:sz w:val="16"/>
         </w:rPr>
-        <w:t>————————————————————</w:t>
+        <w:t>..............................</w:t>
       </w:r>
     </w:p>
     <w:p>
@@ -10091,12 +9761,7 @@
           <w:color w:val="6E6E6E"/>
           <w:sz w:val="16"/>
         </w:rPr>
-        <w:t>————————————————————</w:t>
-      </w:r>
-    </w:p>
-    <w:p>
-      <w:r>
-        <w:br w:type="page"/>
+        <w:t>..............................</w:t>
       </w:r>
     </w:p>
     <w:p>
@@ -10104,7 +9769,7 @@
         <w:pStyle w:val="Heading1"/>
       </w:pPr>
       <w:r>
-        <w:t>11. Risks, disclaimers, moderation</w:t>
+        <w:t>11. My risks, disclaimers, moderation</w:t>
       </w:r>
     </w:p>
     <w:p>
@@ -10112,7 +9777,7 @@
         <w:pStyle w:val="ListBullet"/>
       </w:pPr>
       <w:r>
-        <w:t>Every post about Crimea RWA and CFA must carry an explicit label: educational example, not an offer, not investment advice. This is not boilerplate, it is a legal line Yurich himself draws on the site, and it cannot be erased for the sake of virality.</w:t>
+        <w:t>Every post I write about Crimea RWA and CFA carries an explicit label: educational example, not an offer, not investment advice. This is not boilerplate for me, it is my own legal line, and I will not erase it for the sake of virality.</w:t>
       </w:r>
     </w:p>
     <w:p>
@@ -10120,7 +9785,7 @@
         <w:pStyle w:val="ListBullet"/>
       </w:pPr>
       <w:r>
-        <w:t>For English language comments, prepare a short standard answer in advance for "how can I, as a foreigner, invest in this": the honest answer is "right now this is not an offer to international investors, it is a demonstration of a model that can be replicated in your own jurisdiction," with no attempt to dodge the question.</w:t>
+        <w:t>For English language comments, I keep a short standard answer ready for "how can I, as a foreigner, invest in this": the honest answer I give is "right now this is not an offer to international investors, it is a demonstration of a model that can be replicated in your own jurisdiction," with no attempt to dodge the question.</w:t>
       </w:r>
     </w:p>
     <w:p>
@@ -10128,7 +9793,7 @@
         <w:pStyle w:val="ListBullet"/>
       </w:pPr>
       <w:r>
-        <w:t>Never promise what a module does not do: the course gives no signals, Sevastopol AI does not sell CFAs, City Code is not a discount card, Crimea RWA is still a horizon, not a live public issuance, unless that has genuinely changed by the time of publishing.</w:t>
+        <w:t>I never promise what my module does not do: the course gives no signals, Sevastopol AI does not sell CFAs, City Code is not a discount card, Crimea RWA is still a horizon, not a live public issuance, unless that has genuinely changed by the time I publish.</w:t>
       </w:r>
     </w:p>
     <w:p>
@@ -10136,7 +9801,7 @@
         <w:pStyle w:val="ListBullet"/>
       </w:pPr>
       <w:r>
-        <w:t>Political neutrality: content should talk about the city, the mechanics and the economy, not the political status of the territory. Moderate any comments on that topic neutrally, do not engage in the debate, steer the conversation back to the product and the mechanics.</w:t>
+        <w:t>Political neutrality: I talk about the city, the mechanics and the economy, not the political status of the territory. I moderate any comments on that topic neutrally, I do not engage in the debate, I steer the conversation back to the product and the mechanics.</w:t>
       </w:r>
     </w:p>
     <w:p>
@@ -10144,7 +9809,7 @@
         <w:pStyle w:val="ListBullet"/>
       </w:pPr>
       <w:r>
-        <w:t>Any number in a post (bot users, City Code members, issuance size) must be real as of the publish date. Three honest cards beat four, one of which was invented for rhythm.</w:t>
+        <w:t>Any number in my post (bot users, City Code members, issuance size) is real as of the publish date. Three honest cards beat four, one of which was invented for rhythm.</w:t>
       </w:r>
     </w:p>
     <w:p>
@@ -10156,12 +9821,7 @@
           <w:color w:val="6E6E6E"/>
           <w:sz w:val="16"/>
         </w:rPr>
-        <w:t>————————————————————</w:t>
-      </w:r>
-    </w:p>
-    <w:p>
-      <w:r>
-        <w:br w:type="page"/>
+        <w:t>..............................</w:t>
       </w:r>
     </w:p>
     <w:p>
@@ -10169,7 +9829,7 @@
         <w:pStyle w:val="Heading1"/>
       </w:pPr>
       <w:r>
-        <w:t>12. Positioning in three sentences</w:t>
+        <w:t>12. My positioning in three sentences</w:t>
       </w:r>
     </w:p>
     <w:p>
@@ -10181,12 +9841,12 @@
           <w:i/>
           <w:sz w:val="24"/>
         </w:rPr>
-        <w:t>Yurich (Pavel Vasilkovsky, Sevastopol) is building Russia's first bottom up, city level RWA infrastructure: a free AI bot opens the city, a closed circle called City Code turns interest into community, and Crimea RWA tests whether a city's real revenue can be legally wrapped into a digital financial asset under Russia's 259-FZ law.</w:t>
-      </w:r>
-    </w:p>
-    <w:p>
-      <w:r>
-        <w:t>He is not a token factory and not a crypto evangelist: Yurich openly calls himself "not the operator, not the exchange," monetizes a paid business service before raising venture capital, and turns down clients when the numbers do not justify the structure. His 2026 to 2030 bet is simple: if one real city's economy can be legally and trustfully wrapped into an asset, the same playbook can be repeated in any city on earth, and he intends to be the one who writes it first.</w:t>
+        <w:t>I, Yurich (Pavel Vasilkovsky, Sevastopol), am building Russia's first bottom up, city level RWA infrastructure: a free AI bot opens the city, a closed circle called City Code turns interest into community, and Crimea RWA tests whether a city's real revenue can be legally wrapped into a digital financial asset under Russia's 259-FZ law.</w:t>
+      </w:r>
+    </w:p>
+    <w:p>
+      <w:r>
+        <w:t>I am not a token factory and not a crypto evangelist: I openly call myself "not the operator, not the exchange," I monetize a paid business service before raising venture capital, and I turn down clients when the numbers do not justify the structure. My 2026 to 2030 bet is simple: if one real city's economy can be legally and trustfully wrapped into an asset, the same playbook can be repeated in any city on earth, and I intend to be the one who writes it first.</w:t>
       </w:r>
     </w:p>
     <w:sectPr>

</xml_diff>